<commit_message>
Added Non-Functional Requirements and GUI prototypes to documentation
</commit_message>
<xml_diff>
--- a/labs/LAB2_ISS.docx
+++ b/labs/LAB2_ISS.docx
@@ -9122,6 +9122,3377 @@
         </w:rPr>
       </w:pPr>
     </w:p>
+    <w:p>
+      <w:pPr>
+        <w:pStyle w:val="Heading3"/>
+        <w:rPr>
+          <w:sz w:val="28"/>
+          <w:szCs w:val="28"/>
+        </w:rPr>
+      </w:pPr>
+      <w:r>
+        <w:rPr>
+          <w:sz w:val="28"/>
+          <w:szCs w:val="28"/>
+        </w:rPr>
+        <w:lastRenderedPageBreak/>
+        <w:t>Non-</w:t>
+      </w:r>
+      <w:proofErr w:type="spellStart"/>
+      <w:r>
+        <w:rPr>
+          <w:sz w:val="28"/>
+          <w:szCs w:val="28"/>
+        </w:rPr>
+        <w:t>Functional</w:t>
+      </w:r>
+      <w:proofErr w:type="spellEnd"/>
+      <w:r>
+        <w:rPr>
+          <w:sz w:val="28"/>
+          <w:szCs w:val="28"/>
+        </w:rPr>
+        <w:t xml:space="preserve"> </w:t>
+      </w:r>
+      <w:proofErr w:type="spellStart"/>
+      <w:r>
+        <w:rPr>
+          <w:sz w:val="28"/>
+          <w:szCs w:val="28"/>
+        </w:rPr>
+        <w:t>Requirements</w:t>
+      </w:r>
+      <w:proofErr w:type="spellEnd"/>
+      <w:r>
+        <w:rPr>
+          <w:sz w:val="28"/>
+          <w:szCs w:val="28"/>
+        </w:rPr>
+        <w:t xml:space="preserve"> for </w:t>
+      </w:r>
+      <w:proofErr w:type="spellStart"/>
+      <w:r>
+        <w:rPr>
+          <w:sz w:val="28"/>
+          <w:szCs w:val="28"/>
+        </w:rPr>
+        <w:t>EventStudio</w:t>
+      </w:r>
+      <w:proofErr w:type="spellEnd"/>
+    </w:p>
+    <w:p>
+      <w:pPr>
+        <w:pStyle w:val="NormalWeb"/>
+        <w:rPr>
+          <w:sz w:val="28"/>
+          <w:szCs w:val="28"/>
+        </w:rPr>
+      </w:pPr>
+      <w:r>
+        <w:rPr>
+          <w:b/>
+          <w:bCs/>
+          <w:sz w:val="28"/>
+          <w:szCs w:val="28"/>
+        </w:rPr>
+        <w:t xml:space="preserve">NFR-1: </w:t>
+      </w:r>
+      <w:proofErr w:type="spellStart"/>
+      <w:r>
+        <w:rPr>
+          <w:b/>
+          <w:bCs/>
+          <w:sz w:val="28"/>
+          <w:szCs w:val="28"/>
+        </w:rPr>
+        <w:t>Password</w:t>
+      </w:r>
+      <w:proofErr w:type="spellEnd"/>
+      <w:r>
+        <w:rPr>
+          <w:b/>
+          <w:bCs/>
+          <w:sz w:val="28"/>
+          <w:szCs w:val="28"/>
+        </w:rPr>
+        <w:t xml:space="preserve"> </w:t>
+      </w:r>
+      <w:proofErr w:type="spellStart"/>
+      <w:r>
+        <w:rPr>
+          <w:b/>
+          <w:bCs/>
+          <w:sz w:val="28"/>
+          <w:szCs w:val="28"/>
+        </w:rPr>
+        <w:t>Storage</w:t>
+      </w:r>
+      <w:proofErr w:type="spellEnd"/>
+      <w:r>
+        <w:rPr>
+          <w:b/>
+          <w:bCs/>
+          <w:sz w:val="28"/>
+          <w:szCs w:val="28"/>
+        </w:rPr>
+        <w:t xml:space="preserve"> &amp; </w:t>
+      </w:r>
+      <w:proofErr w:type="spellStart"/>
+      <w:r>
+        <w:rPr>
+          <w:b/>
+          <w:bCs/>
+          <w:sz w:val="28"/>
+          <w:szCs w:val="28"/>
+        </w:rPr>
+        <w:t>Security</w:t>
+      </w:r>
+      <w:proofErr w:type="spellEnd"/>
+    </w:p>
+    <w:p>
+      <w:pPr>
+        <w:pStyle w:val="NormalWeb"/>
+        <w:numPr>
+          <w:ilvl w:val="0"/>
+          <w:numId w:val="4"/>
+        </w:numPr>
+        <w:rPr>
+          <w:sz w:val="28"/>
+          <w:szCs w:val="28"/>
+        </w:rPr>
+      </w:pPr>
+      <w:proofErr w:type="spellStart"/>
+      <w:r>
+        <w:rPr>
+          <w:b/>
+          <w:bCs/>
+          <w:sz w:val="28"/>
+          <w:szCs w:val="28"/>
+        </w:rPr>
+        <w:t>Description</w:t>
+      </w:r>
+      <w:proofErr w:type="spellEnd"/>
+      <w:r>
+        <w:rPr>
+          <w:b/>
+          <w:bCs/>
+          <w:sz w:val="28"/>
+          <w:szCs w:val="28"/>
+        </w:rPr>
+        <w:t>:</w:t>
+      </w:r>
+      <w:r>
+        <w:rPr>
+          <w:sz w:val="28"/>
+          <w:szCs w:val="28"/>
+        </w:rPr>
+        <w:t xml:space="preserve"> The </w:t>
+      </w:r>
+      <w:proofErr w:type="spellStart"/>
+      <w:r>
+        <w:rPr>
+          <w:sz w:val="28"/>
+          <w:szCs w:val="28"/>
+        </w:rPr>
+        <w:t>system</w:t>
+      </w:r>
+      <w:proofErr w:type="spellEnd"/>
+      <w:r>
+        <w:rPr>
+          <w:sz w:val="28"/>
+          <w:szCs w:val="28"/>
+        </w:rPr>
+        <w:t xml:space="preserve"> </w:t>
+      </w:r>
+      <w:proofErr w:type="spellStart"/>
+      <w:r>
+        <w:rPr>
+          <w:sz w:val="28"/>
+          <w:szCs w:val="28"/>
+        </w:rPr>
+        <w:t>shall</w:t>
+      </w:r>
+      <w:proofErr w:type="spellEnd"/>
+      <w:r>
+        <w:rPr>
+          <w:sz w:val="28"/>
+          <w:szCs w:val="28"/>
+        </w:rPr>
+        <w:t xml:space="preserve"> </w:t>
+      </w:r>
+      <w:proofErr w:type="spellStart"/>
+      <w:r>
+        <w:rPr>
+          <w:sz w:val="28"/>
+          <w:szCs w:val="28"/>
+        </w:rPr>
+        <w:t>securely</w:t>
+      </w:r>
+      <w:proofErr w:type="spellEnd"/>
+      <w:r>
+        <w:rPr>
+          <w:sz w:val="28"/>
+          <w:szCs w:val="28"/>
+        </w:rPr>
+        <w:t xml:space="preserve"> </w:t>
+      </w:r>
+      <w:proofErr w:type="spellStart"/>
+      <w:r>
+        <w:rPr>
+          <w:sz w:val="28"/>
+          <w:szCs w:val="28"/>
+        </w:rPr>
+        <w:t>store</w:t>
+      </w:r>
+      <w:proofErr w:type="spellEnd"/>
+      <w:r>
+        <w:rPr>
+          <w:sz w:val="28"/>
+          <w:szCs w:val="28"/>
+        </w:rPr>
+        <w:t xml:space="preserve"> </w:t>
+      </w:r>
+      <w:proofErr w:type="spellStart"/>
+      <w:r>
+        <w:rPr>
+          <w:sz w:val="28"/>
+          <w:szCs w:val="28"/>
+        </w:rPr>
+        <w:t>user</w:t>
+      </w:r>
+      <w:proofErr w:type="spellEnd"/>
+      <w:r>
+        <w:rPr>
+          <w:sz w:val="28"/>
+          <w:szCs w:val="28"/>
+        </w:rPr>
+        <w:t xml:space="preserve"> </w:t>
+      </w:r>
+      <w:proofErr w:type="spellStart"/>
+      <w:r>
+        <w:rPr>
+          <w:sz w:val="28"/>
+          <w:szCs w:val="28"/>
+        </w:rPr>
+        <w:t>credentials</w:t>
+      </w:r>
+      <w:proofErr w:type="spellEnd"/>
+      <w:r>
+        <w:rPr>
+          <w:sz w:val="28"/>
+          <w:szCs w:val="28"/>
+        </w:rPr>
+        <w:t>.</w:t>
+      </w:r>
+    </w:p>
+    <w:p>
+      <w:pPr>
+        <w:pStyle w:val="NormalWeb"/>
+        <w:numPr>
+          <w:ilvl w:val="0"/>
+          <w:numId w:val="4"/>
+        </w:numPr>
+        <w:rPr>
+          <w:sz w:val="28"/>
+          <w:szCs w:val="28"/>
+        </w:rPr>
+      </w:pPr>
+      <w:proofErr w:type="spellStart"/>
+      <w:r>
+        <w:rPr>
+          <w:b/>
+          <w:bCs/>
+          <w:sz w:val="28"/>
+          <w:szCs w:val="28"/>
+        </w:rPr>
+        <w:t>Criteria</w:t>
+      </w:r>
+      <w:proofErr w:type="spellEnd"/>
+      <w:r>
+        <w:rPr>
+          <w:b/>
+          <w:bCs/>
+          <w:sz w:val="28"/>
+          <w:szCs w:val="28"/>
+        </w:rPr>
+        <w:t>:</w:t>
+      </w:r>
+      <w:r>
+        <w:rPr>
+          <w:sz w:val="28"/>
+          <w:szCs w:val="28"/>
+        </w:rPr>
+        <w:t xml:space="preserve"> </w:t>
+      </w:r>
+      <w:proofErr w:type="spellStart"/>
+      <w:r>
+        <w:rPr>
+          <w:sz w:val="28"/>
+          <w:szCs w:val="28"/>
+        </w:rPr>
+        <w:t>Passwords</w:t>
+      </w:r>
+      <w:proofErr w:type="spellEnd"/>
+      <w:r>
+        <w:rPr>
+          <w:sz w:val="28"/>
+          <w:szCs w:val="28"/>
+        </w:rPr>
+        <w:t xml:space="preserve"> must </w:t>
+      </w:r>
+      <w:proofErr w:type="spellStart"/>
+      <w:r>
+        <w:rPr>
+          <w:sz w:val="28"/>
+          <w:szCs w:val="28"/>
+        </w:rPr>
+        <w:t>be</w:t>
+      </w:r>
+      <w:proofErr w:type="spellEnd"/>
+      <w:r>
+        <w:rPr>
+          <w:sz w:val="28"/>
+          <w:szCs w:val="28"/>
+        </w:rPr>
+        <w:t xml:space="preserve"> </w:t>
+      </w:r>
+      <w:proofErr w:type="spellStart"/>
+      <w:r>
+        <w:rPr>
+          <w:sz w:val="28"/>
+          <w:szCs w:val="28"/>
+        </w:rPr>
+        <w:t>hashed</w:t>
+      </w:r>
+      <w:proofErr w:type="spellEnd"/>
+      <w:r>
+        <w:rPr>
+          <w:sz w:val="28"/>
+          <w:szCs w:val="28"/>
+        </w:rPr>
+        <w:t xml:space="preserve"> </w:t>
+      </w:r>
+      <w:proofErr w:type="spellStart"/>
+      <w:r>
+        <w:rPr>
+          <w:sz w:val="28"/>
+          <w:szCs w:val="28"/>
+        </w:rPr>
+        <w:t>using</w:t>
+      </w:r>
+      <w:proofErr w:type="spellEnd"/>
+      <w:r>
+        <w:rPr>
+          <w:sz w:val="28"/>
+          <w:szCs w:val="28"/>
+        </w:rPr>
+        <w:t xml:space="preserve"> a </w:t>
+      </w:r>
+      <w:proofErr w:type="spellStart"/>
+      <w:r>
+        <w:rPr>
+          <w:sz w:val="28"/>
+          <w:szCs w:val="28"/>
+        </w:rPr>
+        <w:t>strong</w:t>
+      </w:r>
+      <w:proofErr w:type="spellEnd"/>
+      <w:r>
+        <w:rPr>
+          <w:sz w:val="28"/>
+          <w:szCs w:val="28"/>
+        </w:rPr>
+        <w:t xml:space="preserve"> </w:t>
+      </w:r>
+      <w:proofErr w:type="spellStart"/>
+      <w:r>
+        <w:rPr>
+          <w:sz w:val="28"/>
+          <w:szCs w:val="28"/>
+        </w:rPr>
+        <w:t>algorithm</w:t>
+      </w:r>
+      <w:proofErr w:type="spellEnd"/>
+      <w:r>
+        <w:rPr>
+          <w:sz w:val="28"/>
+          <w:szCs w:val="28"/>
+        </w:rPr>
+        <w:t xml:space="preserve"> (e.g., </w:t>
+      </w:r>
+      <w:proofErr w:type="spellStart"/>
+      <w:r>
+        <w:rPr>
+          <w:sz w:val="28"/>
+          <w:szCs w:val="28"/>
+        </w:rPr>
+        <w:t>bcrypt</w:t>
+      </w:r>
+      <w:proofErr w:type="spellEnd"/>
+      <w:r>
+        <w:rPr>
+          <w:sz w:val="28"/>
+          <w:szCs w:val="28"/>
+        </w:rPr>
+        <w:t xml:space="preserve">) </w:t>
+      </w:r>
+      <w:proofErr w:type="spellStart"/>
+      <w:r>
+        <w:rPr>
+          <w:sz w:val="28"/>
+          <w:szCs w:val="28"/>
+        </w:rPr>
+        <w:t>before</w:t>
+      </w:r>
+      <w:proofErr w:type="spellEnd"/>
+      <w:r>
+        <w:rPr>
+          <w:sz w:val="28"/>
+          <w:szCs w:val="28"/>
+        </w:rPr>
+        <w:t xml:space="preserve"> </w:t>
+      </w:r>
+      <w:proofErr w:type="spellStart"/>
+      <w:r>
+        <w:rPr>
+          <w:sz w:val="28"/>
+          <w:szCs w:val="28"/>
+        </w:rPr>
+        <w:t>saving</w:t>
+      </w:r>
+      <w:proofErr w:type="spellEnd"/>
+      <w:r>
+        <w:rPr>
+          <w:sz w:val="28"/>
+          <w:szCs w:val="28"/>
+        </w:rPr>
+        <w:t xml:space="preserve"> </w:t>
+      </w:r>
+      <w:proofErr w:type="spellStart"/>
+      <w:r>
+        <w:rPr>
+          <w:sz w:val="28"/>
+          <w:szCs w:val="28"/>
+        </w:rPr>
+        <w:t>to</w:t>
+      </w:r>
+      <w:proofErr w:type="spellEnd"/>
+      <w:r>
+        <w:rPr>
+          <w:sz w:val="28"/>
+          <w:szCs w:val="28"/>
+        </w:rPr>
+        <w:t xml:space="preserve"> </w:t>
+      </w:r>
+      <w:proofErr w:type="spellStart"/>
+      <w:r>
+        <w:rPr>
+          <w:sz w:val="28"/>
+          <w:szCs w:val="28"/>
+        </w:rPr>
+        <w:t>the</w:t>
+      </w:r>
+      <w:proofErr w:type="spellEnd"/>
+      <w:r>
+        <w:rPr>
+          <w:sz w:val="28"/>
+          <w:szCs w:val="28"/>
+        </w:rPr>
+        <w:t xml:space="preserve"> </w:t>
+      </w:r>
+      <w:proofErr w:type="spellStart"/>
+      <w:r>
+        <w:rPr>
+          <w:sz w:val="28"/>
+          <w:szCs w:val="28"/>
+        </w:rPr>
+        <w:t>database</w:t>
+      </w:r>
+      <w:proofErr w:type="spellEnd"/>
+      <w:r>
+        <w:rPr>
+          <w:sz w:val="28"/>
+          <w:szCs w:val="28"/>
+        </w:rPr>
+        <w:t xml:space="preserve">. No </w:t>
+      </w:r>
+      <w:proofErr w:type="spellStart"/>
+      <w:r>
+        <w:rPr>
+          <w:sz w:val="28"/>
+          <w:szCs w:val="28"/>
+        </w:rPr>
+        <w:t>plaintext</w:t>
+      </w:r>
+      <w:proofErr w:type="spellEnd"/>
+      <w:r>
+        <w:rPr>
+          <w:sz w:val="28"/>
+          <w:szCs w:val="28"/>
+        </w:rPr>
+        <w:t xml:space="preserve"> </w:t>
+      </w:r>
+      <w:proofErr w:type="spellStart"/>
+      <w:r>
+        <w:rPr>
+          <w:sz w:val="28"/>
+          <w:szCs w:val="28"/>
+        </w:rPr>
+        <w:t>password</w:t>
+      </w:r>
+      <w:proofErr w:type="spellEnd"/>
+      <w:r>
+        <w:rPr>
+          <w:sz w:val="28"/>
+          <w:szCs w:val="28"/>
+        </w:rPr>
+        <w:t xml:space="preserve"> </w:t>
+      </w:r>
+      <w:proofErr w:type="spellStart"/>
+      <w:r>
+        <w:rPr>
+          <w:sz w:val="28"/>
+          <w:szCs w:val="28"/>
+        </w:rPr>
+        <w:t>storage</w:t>
+      </w:r>
+      <w:proofErr w:type="spellEnd"/>
+      <w:r>
+        <w:rPr>
+          <w:sz w:val="28"/>
+          <w:szCs w:val="28"/>
+        </w:rPr>
+        <w:t xml:space="preserve"> </w:t>
+      </w:r>
+      <w:proofErr w:type="spellStart"/>
+      <w:r>
+        <w:rPr>
+          <w:sz w:val="28"/>
+          <w:szCs w:val="28"/>
+        </w:rPr>
+        <w:t>is</w:t>
+      </w:r>
+      <w:proofErr w:type="spellEnd"/>
+      <w:r>
+        <w:rPr>
+          <w:sz w:val="28"/>
+          <w:szCs w:val="28"/>
+        </w:rPr>
+        <w:t xml:space="preserve"> </w:t>
+      </w:r>
+      <w:proofErr w:type="spellStart"/>
+      <w:r>
+        <w:rPr>
+          <w:sz w:val="28"/>
+          <w:szCs w:val="28"/>
+        </w:rPr>
+        <w:t>allowed</w:t>
+      </w:r>
+      <w:proofErr w:type="spellEnd"/>
+      <w:r>
+        <w:rPr>
+          <w:sz w:val="28"/>
+          <w:szCs w:val="28"/>
+        </w:rPr>
+        <w:t>.</w:t>
+      </w:r>
+    </w:p>
+    <w:p>
+      <w:pPr>
+        <w:pStyle w:val="NormalWeb"/>
+        <w:numPr>
+          <w:ilvl w:val="0"/>
+          <w:numId w:val="4"/>
+        </w:numPr>
+        <w:rPr>
+          <w:sz w:val="28"/>
+          <w:szCs w:val="28"/>
+        </w:rPr>
+      </w:pPr>
+      <w:proofErr w:type="spellStart"/>
+      <w:r>
+        <w:rPr>
+          <w:b/>
+          <w:bCs/>
+          <w:sz w:val="28"/>
+          <w:szCs w:val="28"/>
+        </w:rPr>
+        <w:t>Priority</w:t>
+      </w:r>
+      <w:proofErr w:type="spellEnd"/>
+      <w:r>
+        <w:rPr>
+          <w:b/>
+          <w:bCs/>
+          <w:sz w:val="28"/>
+          <w:szCs w:val="28"/>
+        </w:rPr>
+        <w:t>:</w:t>
+      </w:r>
+      <w:r>
+        <w:rPr>
+          <w:sz w:val="28"/>
+          <w:szCs w:val="28"/>
+        </w:rPr>
+        <w:t xml:space="preserve"> </w:t>
+      </w:r>
+      <w:proofErr w:type="spellStart"/>
+      <w:r>
+        <w:rPr>
+          <w:sz w:val="28"/>
+          <w:szCs w:val="28"/>
+        </w:rPr>
+        <w:t>Critical</w:t>
+      </w:r>
+      <w:proofErr w:type="spellEnd"/>
+    </w:p>
+    <w:p>
+      <w:pPr>
+        <w:pStyle w:val="NormalWeb"/>
+        <w:numPr>
+          <w:ilvl w:val="0"/>
+          <w:numId w:val="4"/>
+        </w:numPr>
+        <w:rPr>
+          <w:sz w:val="28"/>
+          <w:szCs w:val="28"/>
+        </w:rPr>
+      </w:pPr>
+      <w:proofErr w:type="spellStart"/>
+      <w:r>
+        <w:rPr>
+          <w:b/>
+          <w:bCs/>
+          <w:sz w:val="28"/>
+          <w:szCs w:val="28"/>
+        </w:rPr>
+        <w:t>Rationale</w:t>
+      </w:r>
+      <w:proofErr w:type="spellEnd"/>
+      <w:r>
+        <w:rPr>
+          <w:b/>
+          <w:bCs/>
+          <w:sz w:val="28"/>
+          <w:szCs w:val="28"/>
+        </w:rPr>
+        <w:t>:</w:t>
+      </w:r>
+      <w:r>
+        <w:rPr>
+          <w:sz w:val="28"/>
+          <w:szCs w:val="28"/>
+        </w:rPr>
+        <w:t xml:space="preserve"> </w:t>
+      </w:r>
+      <w:proofErr w:type="spellStart"/>
+      <w:r>
+        <w:rPr>
+          <w:sz w:val="28"/>
+          <w:szCs w:val="28"/>
+        </w:rPr>
+        <w:t>Protect</w:t>
+      </w:r>
+      <w:proofErr w:type="spellEnd"/>
+      <w:r>
+        <w:rPr>
+          <w:sz w:val="28"/>
+          <w:szCs w:val="28"/>
+        </w:rPr>
+        <w:t xml:space="preserve"> </w:t>
+      </w:r>
+      <w:proofErr w:type="spellStart"/>
+      <w:r>
+        <w:rPr>
+          <w:sz w:val="28"/>
+          <w:szCs w:val="28"/>
+        </w:rPr>
+        <w:t>organizer</w:t>
+      </w:r>
+      <w:proofErr w:type="spellEnd"/>
+      <w:r>
+        <w:rPr>
+          <w:sz w:val="28"/>
+          <w:szCs w:val="28"/>
+        </w:rPr>
+        <w:t xml:space="preserve"> </w:t>
+      </w:r>
+      <w:proofErr w:type="spellStart"/>
+      <w:r>
+        <w:rPr>
+          <w:sz w:val="28"/>
+          <w:szCs w:val="28"/>
+        </w:rPr>
+        <w:t>accounts</w:t>
+      </w:r>
+      <w:proofErr w:type="spellEnd"/>
+      <w:r>
+        <w:rPr>
+          <w:sz w:val="28"/>
+          <w:szCs w:val="28"/>
+        </w:rPr>
+        <w:t xml:space="preserve">, </w:t>
+      </w:r>
+      <w:proofErr w:type="spellStart"/>
+      <w:r>
+        <w:rPr>
+          <w:sz w:val="28"/>
+          <w:szCs w:val="28"/>
+        </w:rPr>
+        <w:t>financial</w:t>
+      </w:r>
+      <w:proofErr w:type="spellEnd"/>
+      <w:r>
+        <w:rPr>
+          <w:sz w:val="28"/>
+          <w:szCs w:val="28"/>
+        </w:rPr>
+        <w:t xml:space="preserve"> data, </w:t>
+      </w:r>
+      <w:proofErr w:type="spellStart"/>
+      <w:r>
+        <w:rPr>
+          <w:sz w:val="28"/>
+          <w:szCs w:val="28"/>
+        </w:rPr>
+        <w:t>and</w:t>
+      </w:r>
+      <w:proofErr w:type="spellEnd"/>
+      <w:r>
+        <w:rPr>
+          <w:sz w:val="28"/>
+          <w:szCs w:val="28"/>
+        </w:rPr>
+        <w:t xml:space="preserve"> </w:t>
+      </w:r>
+      <w:proofErr w:type="spellStart"/>
+      <w:r>
+        <w:rPr>
+          <w:sz w:val="28"/>
+          <w:szCs w:val="28"/>
+        </w:rPr>
+        <w:t>guest</w:t>
+      </w:r>
+      <w:proofErr w:type="spellEnd"/>
+      <w:r>
+        <w:rPr>
+          <w:sz w:val="28"/>
+          <w:szCs w:val="28"/>
+        </w:rPr>
+        <w:t xml:space="preserve"> </w:t>
+      </w:r>
+      <w:proofErr w:type="spellStart"/>
+      <w:r>
+        <w:rPr>
+          <w:sz w:val="28"/>
+          <w:szCs w:val="28"/>
+        </w:rPr>
+        <w:t>lists</w:t>
+      </w:r>
+      <w:proofErr w:type="spellEnd"/>
+      <w:r>
+        <w:rPr>
+          <w:sz w:val="28"/>
+          <w:szCs w:val="28"/>
+        </w:rPr>
+        <w:t xml:space="preserve"> in case of a </w:t>
+      </w:r>
+      <w:proofErr w:type="spellStart"/>
+      <w:r>
+        <w:rPr>
+          <w:sz w:val="28"/>
+          <w:szCs w:val="28"/>
+        </w:rPr>
+        <w:t>database</w:t>
+      </w:r>
+      <w:proofErr w:type="spellEnd"/>
+      <w:r>
+        <w:rPr>
+          <w:sz w:val="28"/>
+          <w:szCs w:val="28"/>
+        </w:rPr>
+        <w:t xml:space="preserve"> </w:t>
+      </w:r>
+      <w:proofErr w:type="spellStart"/>
+      <w:r>
+        <w:rPr>
+          <w:sz w:val="28"/>
+          <w:szCs w:val="28"/>
+        </w:rPr>
+        <w:t>breach</w:t>
+      </w:r>
+      <w:proofErr w:type="spellEnd"/>
+      <w:r>
+        <w:rPr>
+          <w:sz w:val="28"/>
+          <w:szCs w:val="28"/>
+        </w:rPr>
+        <w:t>.</w:t>
+      </w:r>
+    </w:p>
+    <w:p>
+      <w:pPr>
+        <w:pStyle w:val="NormalWeb"/>
+        <w:rPr>
+          <w:sz w:val="28"/>
+          <w:szCs w:val="28"/>
+        </w:rPr>
+      </w:pPr>
+      <w:r>
+        <w:rPr>
+          <w:b/>
+          <w:bCs/>
+          <w:sz w:val="28"/>
+          <w:szCs w:val="28"/>
+        </w:rPr>
+        <w:t xml:space="preserve">NFR-2: </w:t>
+      </w:r>
+      <w:proofErr w:type="spellStart"/>
+      <w:r>
+        <w:rPr>
+          <w:b/>
+          <w:bCs/>
+          <w:sz w:val="28"/>
+          <w:szCs w:val="28"/>
+        </w:rPr>
+        <w:t>Response</w:t>
+      </w:r>
+      <w:proofErr w:type="spellEnd"/>
+      <w:r>
+        <w:rPr>
+          <w:b/>
+          <w:bCs/>
+          <w:sz w:val="28"/>
+          <w:szCs w:val="28"/>
+        </w:rPr>
+        <w:t xml:space="preserve"> Time</w:t>
+      </w:r>
+    </w:p>
+    <w:p>
+      <w:pPr>
+        <w:pStyle w:val="NormalWeb"/>
+        <w:numPr>
+          <w:ilvl w:val="0"/>
+          <w:numId w:val="5"/>
+        </w:numPr>
+        <w:rPr>
+          <w:sz w:val="28"/>
+          <w:szCs w:val="28"/>
+        </w:rPr>
+      </w:pPr>
+      <w:proofErr w:type="spellStart"/>
+      <w:r>
+        <w:rPr>
+          <w:b/>
+          <w:bCs/>
+          <w:sz w:val="28"/>
+          <w:szCs w:val="28"/>
+        </w:rPr>
+        <w:t>Description</w:t>
+      </w:r>
+      <w:proofErr w:type="spellEnd"/>
+      <w:r>
+        <w:rPr>
+          <w:b/>
+          <w:bCs/>
+          <w:sz w:val="28"/>
+          <w:szCs w:val="28"/>
+        </w:rPr>
+        <w:t>:</w:t>
+      </w:r>
+      <w:r>
+        <w:rPr>
+          <w:sz w:val="28"/>
+          <w:szCs w:val="28"/>
+        </w:rPr>
+        <w:t xml:space="preserve"> The </w:t>
+      </w:r>
+      <w:proofErr w:type="spellStart"/>
+      <w:r>
+        <w:rPr>
+          <w:sz w:val="28"/>
+          <w:szCs w:val="28"/>
+        </w:rPr>
+        <w:t>system</w:t>
+      </w:r>
+      <w:proofErr w:type="spellEnd"/>
+      <w:r>
+        <w:rPr>
+          <w:sz w:val="28"/>
+          <w:szCs w:val="28"/>
+        </w:rPr>
+        <w:t xml:space="preserve"> </w:t>
+      </w:r>
+      <w:proofErr w:type="spellStart"/>
+      <w:r>
+        <w:rPr>
+          <w:sz w:val="28"/>
+          <w:szCs w:val="28"/>
+        </w:rPr>
+        <w:t>shall</w:t>
+      </w:r>
+      <w:proofErr w:type="spellEnd"/>
+      <w:r>
+        <w:rPr>
+          <w:sz w:val="28"/>
+          <w:szCs w:val="28"/>
+        </w:rPr>
+        <w:t xml:space="preserve"> </w:t>
+      </w:r>
+      <w:proofErr w:type="spellStart"/>
+      <w:r>
+        <w:rPr>
+          <w:sz w:val="28"/>
+          <w:szCs w:val="28"/>
+        </w:rPr>
+        <w:t>respond</w:t>
+      </w:r>
+      <w:proofErr w:type="spellEnd"/>
+      <w:r>
+        <w:rPr>
+          <w:sz w:val="28"/>
+          <w:szCs w:val="28"/>
+        </w:rPr>
+        <w:t xml:space="preserve"> </w:t>
+      </w:r>
+      <w:proofErr w:type="spellStart"/>
+      <w:r>
+        <w:rPr>
+          <w:sz w:val="28"/>
+          <w:szCs w:val="28"/>
+        </w:rPr>
+        <w:t>to</w:t>
+      </w:r>
+      <w:proofErr w:type="spellEnd"/>
+      <w:r>
+        <w:rPr>
+          <w:sz w:val="28"/>
+          <w:szCs w:val="28"/>
+        </w:rPr>
+        <w:t xml:space="preserve"> </w:t>
+      </w:r>
+      <w:proofErr w:type="spellStart"/>
+      <w:r>
+        <w:rPr>
+          <w:sz w:val="28"/>
+          <w:szCs w:val="28"/>
+        </w:rPr>
+        <w:t>user</w:t>
+      </w:r>
+      <w:proofErr w:type="spellEnd"/>
+      <w:r>
+        <w:rPr>
+          <w:sz w:val="28"/>
+          <w:szCs w:val="28"/>
+        </w:rPr>
+        <w:t xml:space="preserve"> </w:t>
+      </w:r>
+      <w:proofErr w:type="spellStart"/>
+      <w:r>
+        <w:rPr>
+          <w:sz w:val="28"/>
+          <w:szCs w:val="28"/>
+        </w:rPr>
+        <w:t>actions</w:t>
+      </w:r>
+      <w:proofErr w:type="spellEnd"/>
+      <w:r>
+        <w:rPr>
+          <w:sz w:val="28"/>
+          <w:szCs w:val="28"/>
+        </w:rPr>
+        <w:t xml:space="preserve"> </w:t>
+      </w:r>
+      <w:proofErr w:type="spellStart"/>
+      <w:r>
+        <w:rPr>
+          <w:sz w:val="28"/>
+          <w:szCs w:val="28"/>
+        </w:rPr>
+        <w:t>within</w:t>
+      </w:r>
+      <w:proofErr w:type="spellEnd"/>
+      <w:r>
+        <w:rPr>
+          <w:sz w:val="28"/>
+          <w:szCs w:val="28"/>
+        </w:rPr>
+        <w:t xml:space="preserve"> </w:t>
+      </w:r>
+      <w:proofErr w:type="spellStart"/>
+      <w:r>
+        <w:rPr>
+          <w:sz w:val="28"/>
+          <w:szCs w:val="28"/>
+        </w:rPr>
+        <w:t>acceptable</w:t>
+      </w:r>
+      <w:proofErr w:type="spellEnd"/>
+      <w:r>
+        <w:rPr>
+          <w:sz w:val="28"/>
+          <w:szCs w:val="28"/>
+        </w:rPr>
+        <w:t xml:space="preserve"> </w:t>
+      </w:r>
+      <w:proofErr w:type="spellStart"/>
+      <w:r>
+        <w:rPr>
+          <w:sz w:val="28"/>
+          <w:szCs w:val="28"/>
+        </w:rPr>
+        <w:t>time</w:t>
+      </w:r>
+      <w:proofErr w:type="spellEnd"/>
+      <w:r>
+        <w:rPr>
+          <w:sz w:val="28"/>
+          <w:szCs w:val="28"/>
+        </w:rPr>
+        <w:t xml:space="preserve"> </w:t>
+      </w:r>
+      <w:proofErr w:type="spellStart"/>
+      <w:r>
+        <w:rPr>
+          <w:sz w:val="28"/>
+          <w:szCs w:val="28"/>
+        </w:rPr>
+        <w:t>limits</w:t>
+      </w:r>
+      <w:proofErr w:type="spellEnd"/>
+      <w:r>
+        <w:rPr>
+          <w:sz w:val="28"/>
+          <w:szCs w:val="28"/>
+        </w:rPr>
+        <w:t>.</w:t>
+      </w:r>
+    </w:p>
+    <w:p>
+      <w:pPr>
+        <w:pStyle w:val="NormalWeb"/>
+        <w:numPr>
+          <w:ilvl w:val="0"/>
+          <w:numId w:val="5"/>
+        </w:numPr>
+        <w:rPr>
+          <w:sz w:val="28"/>
+          <w:szCs w:val="28"/>
+        </w:rPr>
+      </w:pPr>
+      <w:proofErr w:type="spellStart"/>
+      <w:r>
+        <w:rPr>
+          <w:b/>
+          <w:bCs/>
+          <w:sz w:val="28"/>
+          <w:szCs w:val="28"/>
+        </w:rPr>
+        <w:t>Criteria</w:t>
+      </w:r>
+      <w:proofErr w:type="spellEnd"/>
+      <w:r>
+        <w:rPr>
+          <w:b/>
+          <w:bCs/>
+          <w:sz w:val="28"/>
+          <w:szCs w:val="28"/>
+        </w:rPr>
+        <w:t>:</w:t>
+      </w:r>
+      <w:r>
+        <w:rPr>
+          <w:sz w:val="28"/>
+          <w:szCs w:val="28"/>
+        </w:rPr>
+        <w:t xml:space="preserve"> Budget </w:t>
+      </w:r>
+      <w:proofErr w:type="spellStart"/>
+      <w:r>
+        <w:rPr>
+          <w:sz w:val="28"/>
+          <w:szCs w:val="28"/>
+        </w:rPr>
+        <w:t>Dashboard</w:t>
+      </w:r>
+      <w:proofErr w:type="spellEnd"/>
+      <w:r>
+        <w:rPr>
+          <w:sz w:val="28"/>
+          <w:szCs w:val="28"/>
+        </w:rPr>
+        <w:t xml:space="preserve"> </w:t>
+      </w:r>
+      <w:proofErr w:type="spellStart"/>
+      <w:r>
+        <w:rPr>
+          <w:sz w:val="28"/>
+          <w:szCs w:val="28"/>
+        </w:rPr>
+        <w:t>calculation</w:t>
+      </w:r>
+      <w:proofErr w:type="spellEnd"/>
+      <w:r>
+        <w:rPr>
+          <w:sz w:val="28"/>
+          <w:szCs w:val="28"/>
+        </w:rPr>
+        <w:t xml:space="preserve"> </w:t>
+      </w:r>
+      <w:proofErr w:type="spellStart"/>
+      <w:r>
+        <w:rPr>
+          <w:sz w:val="28"/>
+          <w:szCs w:val="28"/>
+        </w:rPr>
+        <w:t>and</w:t>
+      </w:r>
+      <w:proofErr w:type="spellEnd"/>
+      <w:r>
+        <w:rPr>
+          <w:sz w:val="28"/>
+          <w:szCs w:val="28"/>
+        </w:rPr>
+        <w:t xml:space="preserve"> </w:t>
+      </w:r>
+      <w:proofErr w:type="spellStart"/>
+      <w:r>
+        <w:rPr>
+          <w:sz w:val="28"/>
+          <w:szCs w:val="28"/>
+        </w:rPr>
+        <w:t>rendering</w:t>
+      </w:r>
+      <w:proofErr w:type="spellEnd"/>
+      <w:r>
+        <w:rPr>
+          <w:sz w:val="28"/>
+          <w:szCs w:val="28"/>
+        </w:rPr>
+        <w:t xml:space="preserve">: ≤ 2 </w:t>
+      </w:r>
+      <w:proofErr w:type="spellStart"/>
+      <w:r>
+        <w:rPr>
+          <w:sz w:val="28"/>
+          <w:szCs w:val="28"/>
+        </w:rPr>
+        <w:t>seconds</w:t>
+      </w:r>
+      <w:proofErr w:type="spellEnd"/>
+      <w:r>
+        <w:rPr>
+          <w:sz w:val="28"/>
+          <w:szCs w:val="28"/>
+        </w:rPr>
+        <w:t xml:space="preserve">. </w:t>
+      </w:r>
+      <w:proofErr w:type="spellStart"/>
+      <w:r>
+        <w:rPr>
+          <w:sz w:val="28"/>
+          <w:szCs w:val="28"/>
+        </w:rPr>
+        <w:t>Guest</w:t>
+      </w:r>
+      <w:proofErr w:type="spellEnd"/>
+      <w:r>
+        <w:rPr>
+          <w:sz w:val="28"/>
+          <w:szCs w:val="28"/>
+        </w:rPr>
+        <w:t xml:space="preserve"> </w:t>
+      </w:r>
+      <w:proofErr w:type="spellStart"/>
+      <w:r>
+        <w:rPr>
+          <w:sz w:val="28"/>
+          <w:szCs w:val="28"/>
+        </w:rPr>
+        <w:t>list</w:t>
+      </w:r>
+      <w:proofErr w:type="spellEnd"/>
+      <w:r>
+        <w:rPr>
+          <w:sz w:val="28"/>
+          <w:szCs w:val="28"/>
+        </w:rPr>
+        <w:t xml:space="preserve"> </w:t>
+      </w:r>
+      <w:proofErr w:type="spellStart"/>
+      <w:r>
+        <w:rPr>
+          <w:sz w:val="28"/>
+          <w:szCs w:val="28"/>
+        </w:rPr>
+        <w:t>and</w:t>
+      </w:r>
+      <w:proofErr w:type="spellEnd"/>
+      <w:r>
+        <w:rPr>
+          <w:sz w:val="28"/>
+          <w:szCs w:val="28"/>
+        </w:rPr>
+        <w:t xml:space="preserve"> Task Board </w:t>
+      </w:r>
+      <w:proofErr w:type="spellStart"/>
+      <w:r>
+        <w:rPr>
+          <w:sz w:val="28"/>
+          <w:szCs w:val="28"/>
+        </w:rPr>
+        <w:t>load</w:t>
+      </w:r>
+      <w:proofErr w:type="spellEnd"/>
+      <w:r>
+        <w:rPr>
+          <w:sz w:val="28"/>
+          <w:szCs w:val="28"/>
+        </w:rPr>
+        <w:t xml:space="preserve"> </w:t>
+      </w:r>
+      <w:proofErr w:type="spellStart"/>
+      <w:r>
+        <w:rPr>
+          <w:sz w:val="28"/>
+          <w:szCs w:val="28"/>
+        </w:rPr>
+        <w:t>time</w:t>
+      </w:r>
+      <w:proofErr w:type="spellEnd"/>
+      <w:r>
+        <w:rPr>
+          <w:sz w:val="28"/>
+          <w:szCs w:val="28"/>
+        </w:rPr>
+        <w:t xml:space="preserve">: ≤ 1 </w:t>
+      </w:r>
+      <w:proofErr w:type="spellStart"/>
+      <w:r>
+        <w:rPr>
+          <w:sz w:val="28"/>
+          <w:szCs w:val="28"/>
+        </w:rPr>
+        <w:t>second</w:t>
+      </w:r>
+      <w:proofErr w:type="spellEnd"/>
+      <w:r>
+        <w:rPr>
+          <w:sz w:val="28"/>
+          <w:szCs w:val="28"/>
+        </w:rPr>
+        <w:t>.</w:t>
+      </w:r>
+    </w:p>
+    <w:p>
+      <w:pPr>
+        <w:pStyle w:val="NormalWeb"/>
+        <w:numPr>
+          <w:ilvl w:val="0"/>
+          <w:numId w:val="5"/>
+        </w:numPr>
+        <w:rPr>
+          <w:sz w:val="28"/>
+          <w:szCs w:val="28"/>
+        </w:rPr>
+      </w:pPr>
+      <w:proofErr w:type="spellStart"/>
+      <w:r>
+        <w:rPr>
+          <w:b/>
+          <w:bCs/>
+          <w:sz w:val="28"/>
+          <w:szCs w:val="28"/>
+        </w:rPr>
+        <w:t>Priority</w:t>
+      </w:r>
+      <w:proofErr w:type="spellEnd"/>
+      <w:r>
+        <w:rPr>
+          <w:b/>
+          <w:bCs/>
+          <w:sz w:val="28"/>
+          <w:szCs w:val="28"/>
+        </w:rPr>
+        <w:t>:</w:t>
+      </w:r>
+      <w:r>
+        <w:rPr>
+          <w:sz w:val="28"/>
+          <w:szCs w:val="28"/>
+        </w:rPr>
+        <w:t xml:space="preserve"> </w:t>
+      </w:r>
+      <w:proofErr w:type="spellStart"/>
+      <w:r>
+        <w:rPr>
+          <w:sz w:val="28"/>
+          <w:szCs w:val="28"/>
+        </w:rPr>
+        <w:t>High</w:t>
+      </w:r>
+      <w:proofErr w:type="spellEnd"/>
+    </w:p>
+    <w:p>
+      <w:pPr>
+        <w:pStyle w:val="NormalWeb"/>
+        <w:numPr>
+          <w:ilvl w:val="0"/>
+          <w:numId w:val="5"/>
+        </w:numPr>
+        <w:rPr>
+          <w:sz w:val="28"/>
+          <w:szCs w:val="28"/>
+        </w:rPr>
+      </w:pPr>
+      <w:proofErr w:type="spellStart"/>
+      <w:r>
+        <w:rPr>
+          <w:b/>
+          <w:bCs/>
+          <w:sz w:val="28"/>
+          <w:szCs w:val="28"/>
+        </w:rPr>
+        <w:t>Rationale</w:t>
+      </w:r>
+      <w:proofErr w:type="spellEnd"/>
+      <w:r>
+        <w:rPr>
+          <w:b/>
+          <w:bCs/>
+          <w:sz w:val="28"/>
+          <w:szCs w:val="28"/>
+        </w:rPr>
+        <w:t>:</w:t>
+      </w:r>
+      <w:r>
+        <w:rPr>
+          <w:sz w:val="28"/>
+          <w:szCs w:val="28"/>
+        </w:rPr>
+        <w:t xml:space="preserve"> </w:t>
+      </w:r>
+      <w:proofErr w:type="spellStart"/>
+      <w:r>
+        <w:rPr>
+          <w:sz w:val="28"/>
+          <w:szCs w:val="28"/>
+        </w:rPr>
+        <w:t>Organizers</w:t>
+      </w:r>
+      <w:proofErr w:type="spellEnd"/>
+      <w:r>
+        <w:rPr>
+          <w:sz w:val="28"/>
+          <w:szCs w:val="28"/>
+        </w:rPr>
+        <w:t xml:space="preserve"> </w:t>
+      </w:r>
+      <w:proofErr w:type="spellStart"/>
+      <w:r>
+        <w:rPr>
+          <w:sz w:val="28"/>
+          <w:szCs w:val="28"/>
+        </w:rPr>
+        <w:t>expect</w:t>
+      </w:r>
+      <w:proofErr w:type="spellEnd"/>
+      <w:r>
+        <w:rPr>
+          <w:sz w:val="28"/>
+          <w:szCs w:val="28"/>
+        </w:rPr>
+        <w:t xml:space="preserve"> </w:t>
+      </w:r>
+      <w:proofErr w:type="spellStart"/>
+      <w:r>
+        <w:rPr>
+          <w:sz w:val="28"/>
+          <w:szCs w:val="28"/>
+        </w:rPr>
+        <w:t>quick</w:t>
+      </w:r>
+      <w:proofErr w:type="spellEnd"/>
+      <w:r>
+        <w:rPr>
+          <w:sz w:val="28"/>
+          <w:szCs w:val="28"/>
+        </w:rPr>
+        <w:t xml:space="preserve"> </w:t>
+      </w:r>
+      <w:proofErr w:type="spellStart"/>
+      <w:r>
+        <w:rPr>
+          <w:sz w:val="28"/>
+          <w:szCs w:val="28"/>
+        </w:rPr>
+        <w:t>load</w:t>
+      </w:r>
+      <w:proofErr w:type="spellEnd"/>
+      <w:r>
+        <w:rPr>
+          <w:sz w:val="28"/>
+          <w:szCs w:val="28"/>
+        </w:rPr>
+        <w:t xml:space="preserve"> </w:t>
+      </w:r>
+      <w:proofErr w:type="spellStart"/>
+      <w:r>
+        <w:rPr>
+          <w:sz w:val="28"/>
+          <w:szCs w:val="28"/>
+        </w:rPr>
+        <w:t>times</w:t>
+      </w:r>
+      <w:proofErr w:type="spellEnd"/>
+      <w:r>
+        <w:rPr>
+          <w:sz w:val="28"/>
+          <w:szCs w:val="28"/>
+        </w:rPr>
+        <w:t xml:space="preserve"> for a </w:t>
+      </w:r>
+      <w:proofErr w:type="spellStart"/>
+      <w:r>
+        <w:rPr>
+          <w:sz w:val="28"/>
+          <w:szCs w:val="28"/>
+        </w:rPr>
+        <w:t>smooth</w:t>
+      </w:r>
+      <w:proofErr w:type="spellEnd"/>
+      <w:r>
+        <w:rPr>
+          <w:sz w:val="28"/>
+          <w:szCs w:val="28"/>
+        </w:rPr>
+        <w:t xml:space="preserve"> </w:t>
+      </w:r>
+      <w:proofErr w:type="spellStart"/>
+      <w:r>
+        <w:rPr>
+          <w:sz w:val="28"/>
+          <w:szCs w:val="28"/>
+        </w:rPr>
+        <w:t>and</w:t>
+      </w:r>
+      <w:proofErr w:type="spellEnd"/>
+      <w:r>
+        <w:rPr>
+          <w:sz w:val="28"/>
+          <w:szCs w:val="28"/>
+        </w:rPr>
+        <w:t xml:space="preserve"> </w:t>
+      </w:r>
+      <w:proofErr w:type="spellStart"/>
+      <w:r>
+        <w:rPr>
+          <w:sz w:val="28"/>
+          <w:szCs w:val="28"/>
+        </w:rPr>
+        <w:t>efficient</w:t>
+      </w:r>
+      <w:proofErr w:type="spellEnd"/>
+      <w:r>
+        <w:rPr>
+          <w:sz w:val="28"/>
+          <w:szCs w:val="28"/>
+        </w:rPr>
+        <w:t xml:space="preserve"> event </w:t>
+      </w:r>
+      <w:proofErr w:type="spellStart"/>
+      <w:r>
+        <w:rPr>
+          <w:sz w:val="28"/>
+          <w:szCs w:val="28"/>
+        </w:rPr>
+        <w:t>planning</w:t>
+      </w:r>
+      <w:proofErr w:type="spellEnd"/>
+      <w:r>
+        <w:rPr>
+          <w:sz w:val="28"/>
+          <w:szCs w:val="28"/>
+        </w:rPr>
+        <w:t xml:space="preserve"> </w:t>
+      </w:r>
+      <w:proofErr w:type="spellStart"/>
+      <w:r>
+        <w:rPr>
+          <w:sz w:val="28"/>
+          <w:szCs w:val="28"/>
+        </w:rPr>
+        <w:t>experience</w:t>
+      </w:r>
+      <w:proofErr w:type="spellEnd"/>
+      <w:r>
+        <w:rPr>
+          <w:sz w:val="28"/>
+          <w:szCs w:val="28"/>
+        </w:rPr>
+        <w:t xml:space="preserve">, </w:t>
+      </w:r>
+      <w:proofErr w:type="spellStart"/>
+      <w:r>
+        <w:rPr>
+          <w:sz w:val="28"/>
+          <w:szCs w:val="28"/>
+        </w:rPr>
+        <w:t>especially</w:t>
+      </w:r>
+      <w:proofErr w:type="spellEnd"/>
+      <w:r>
+        <w:rPr>
+          <w:sz w:val="28"/>
+          <w:szCs w:val="28"/>
+        </w:rPr>
+        <w:t xml:space="preserve"> </w:t>
+      </w:r>
+      <w:proofErr w:type="spellStart"/>
+      <w:r>
+        <w:rPr>
+          <w:sz w:val="28"/>
+          <w:szCs w:val="28"/>
+        </w:rPr>
+        <w:t>when</w:t>
+      </w:r>
+      <w:proofErr w:type="spellEnd"/>
+      <w:r>
+        <w:rPr>
+          <w:sz w:val="28"/>
+          <w:szCs w:val="28"/>
+        </w:rPr>
+        <w:t xml:space="preserve"> </w:t>
+      </w:r>
+      <w:proofErr w:type="spellStart"/>
+      <w:r>
+        <w:rPr>
+          <w:sz w:val="28"/>
+          <w:szCs w:val="28"/>
+        </w:rPr>
+        <w:t>handling</w:t>
+      </w:r>
+      <w:proofErr w:type="spellEnd"/>
+      <w:r>
+        <w:rPr>
+          <w:sz w:val="28"/>
+          <w:szCs w:val="28"/>
+        </w:rPr>
+        <w:t xml:space="preserve"> </w:t>
+      </w:r>
+      <w:proofErr w:type="spellStart"/>
+      <w:r>
+        <w:rPr>
+          <w:sz w:val="28"/>
+          <w:szCs w:val="28"/>
+        </w:rPr>
+        <w:t>long</w:t>
+      </w:r>
+      <w:proofErr w:type="spellEnd"/>
+      <w:r>
+        <w:rPr>
+          <w:sz w:val="28"/>
+          <w:szCs w:val="28"/>
+        </w:rPr>
+        <w:t xml:space="preserve"> </w:t>
+      </w:r>
+      <w:proofErr w:type="spellStart"/>
+      <w:r>
+        <w:rPr>
+          <w:sz w:val="28"/>
+          <w:szCs w:val="28"/>
+        </w:rPr>
+        <w:t>guest</w:t>
+      </w:r>
+      <w:proofErr w:type="spellEnd"/>
+      <w:r>
+        <w:rPr>
+          <w:sz w:val="28"/>
+          <w:szCs w:val="28"/>
+        </w:rPr>
+        <w:t xml:space="preserve"> </w:t>
+      </w:r>
+      <w:proofErr w:type="spellStart"/>
+      <w:r>
+        <w:rPr>
+          <w:sz w:val="28"/>
+          <w:szCs w:val="28"/>
+        </w:rPr>
+        <w:t>lists</w:t>
+      </w:r>
+      <w:proofErr w:type="spellEnd"/>
+      <w:r>
+        <w:rPr>
+          <w:sz w:val="28"/>
+          <w:szCs w:val="28"/>
+        </w:rPr>
+        <w:t>.</w:t>
+      </w:r>
+    </w:p>
+    <w:p>
+      <w:pPr>
+        <w:pStyle w:val="NormalWeb"/>
+        <w:rPr>
+          <w:sz w:val="28"/>
+          <w:szCs w:val="28"/>
+        </w:rPr>
+      </w:pPr>
+      <w:r>
+        <w:rPr>
+          <w:b/>
+          <w:bCs/>
+          <w:sz w:val="28"/>
+          <w:szCs w:val="28"/>
+        </w:rPr>
+        <w:t xml:space="preserve">NFR-3: </w:t>
+      </w:r>
+      <w:proofErr w:type="spellStart"/>
+      <w:r>
+        <w:rPr>
+          <w:b/>
+          <w:bCs/>
+          <w:sz w:val="28"/>
+          <w:szCs w:val="28"/>
+        </w:rPr>
+        <w:t>Responsive</w:t>
+      </w:r>
+      <w:proofErr w:type="spellEnd"/>
+      <w:r>
+        <w:rPr>
+          <w:b/>
+          <w:bCs/>
+          <w:sz w:val="28"/>
+          <w:szCs w:val="28"/>
+        </w:rPr>
+        <w:t xml:space="preserve"> </w:t>
+      </w:r>
+      <w:proofErr w:type="spellStart"/>
+      <w:r>
+        <w:rPr>
+          <w:b/>
+          <w:bCs/>
+          <w:sz w:val="28"/>
+          <w:szCs w:val="28"/>
+        </w:rPr>
+        <w:t>Usability</w:t>
+      </w:r>
+      <w:proofErr w:type="spellEnd"/>
+    </w:p>
+    <w:p>
+      <w:pPr>
+        <w:pStyle w:val="NormalWeb"/>
+        <w:numPr>
+          <w:ilvl w:val="0"/>
+          <w:numId w:val="6"/>
+        </w:numPr>
+        <w:rPr>
+          <w:sz w:val="28"/>
+          <w:szCs w:val="28"/>
+        </w:rPr>
+      </w:pPr>
+      <w:proofErr w:type="spellStart"/>
+      <w:r>
+        <w:rPr>
+          <w:b/>
+          <w:bCs/>
+          <w:sz w:val="28"/>
+          <w:szCs w:val="28"/>
+        </w:rPr>
+        <w:t>Description</w:t>
+      </w:r>
+      <w:proofErr w:type="spellEnd"/>
+      <w:r>
+        <w:rPr>
+          <w:b/>
+          <w:bCs/>
+          <w:sz w:val="28"/>
+          <w:szCs w:val="28"/>
+        </w:rPr>
+        <w:t>:</w:t>
+      </w:r>
+      <w:r>
+        <w:rPr>
+          <w:sz w:val="28"/>
+          <w:szCs w:val="28"/>
+        </w:rPr>
+        <w:t xml:space="preserve"> The </w:t>
+      </w:r>
+      <w:proofErr w:type="spellStart"/>
+      <w:r>
+        <w:rPr>
+          <w:sz w:val="28"/>
+          <w:szCs w:val="28"/>
+        </w:rPr>
+        <w:t>system</w:t>
+      </w:r>
+      <w:proofErr w:type="spellEnd"/>
+      <w:r>
+        <w:rPr>
+          <w:sz w:val="28"/>
+          <w:szCs w:val="28"/>
+        </w:rPr>
+        <w:t xml:space="preserve"> </w:t>
+      </w:r>
+      <w:proofErr w:type="spellStart"/>
+      <w:r>
+        <w:rPr>
+          <w:sz w:val="28"/>
+          <w:szCs w:val="28"/>
+        </w:rPr>
+        <w:t>interface</w:t>
+      </w:r>
+      <w:proofErr w:type="spellEnd"/>
+      <w:r>
+        <w:rPr>
+          <w:sz w:val="28"/>
+          <w:szCs w:val="28"/>
+        </w:rPr>
+        <w:t xml:space="preserve"> </w:t>
+      </w:r>
+      <w:proofErr w:type="spellStart"/>
+      <w:r>
+        <w:rPr>
+          <w:sz w:val="28"/>
+          <w:szCs w:val="28"/>
+        </w:rPr>
+        <w:t>shall</w:t>
+      </w:r>
+      <w:proofErr w:type="spellEnd"/>
+      <w:r>
+        <w:rPr>
+          <w:sz w:val="28"/>
+          <w:szCs w:val="28"/>
+        </w:rPr>
+        <w:t xml:space="preserve"> </w:t>
+      </w:r>
+      <w:proofErr w:type="spellStart"/>
+      <w:r>
+        <w:rPr>
+          <w:sz w:val="28"/>
+          <w:szCs w:val="28"/>
+        </w:rPr>
+        <w:t>be</w:t>
+      </w:r>
+      <w:proofErr w:type="spellEnd"/>
+      <w:r>
+        <w:rPr>
+          <w:sz w:val="28"/>
+          <w:szCs w:val="28"/>
+        </w:rPr>
+        <w:t xml:space="preserve"> </w:t>
+      </w:r>
+      <w:proofErr w:type="spellStart"/>
+      <w:r>
+        <w:rPr>
+          <w:sz w:val="28"/>
+          <w:szCs w:val="28"/>
+        </w:rPr>
+        <w:t>fully</w:t>
+      </w:r>
+      <w:proofErr w:type="spellEnd"/>
+      <w:r>
+        <w:rPr>
+          <w:sz w:val="28"/>
+          <w:szCs w:val="28"/>
+        </w:rPr>
+        <w:t xml:space="preserve"> </w:t>
+      </w:r>
+      <w:proofErr w:type="spellStart"/>
+      <w:r>
+        <w:rPr>
+          <w:sz w:val="28"/>
+          <w:szCs w:val="28"/>
+        </w:rPr>
+        <w:t>responsive</w:t>
+      </w:r>
+      <w:proofErr w:type="spellEnd"/>
+      <w:r>
+        <w:rPr>
+          <w:sz w:val="28"/>
+          <w:szCs w:val="28"/>
+        </w:rPr>
+        <w:t xml:space="preserve"> </w:t>
+      </w:r>
+      <w:proofErr w:type="spellStart"/>
+      <w:r>
+        <w:rPr>
+          <w:sz w:val="28"/>
+          <w:szCs w:val="28"/>
+        </w:rPr>
+        <w:t>across</w:t>
+      </w:r>
+      <w:proofErr w:type="spellEnd"/>
+      <w:r>
+        <w:rPr>
+          <w:sz w:val="28"/>
+          <w:szCs w:val="28"/>
+        </w:rPr>
+        <w:t xml:space="preserve"> </w:t>
+      </w:r>
+      <w:proofErr w:type="spellStart"/>
+      <w:r>
+        <w:rPr>
+          <w:sz w:val="28"/>
+          <w:szCs w:val="28"/>
+        </w:rPr>
+        <w:t>devices</w:t>
+      </w:r>
+      <w:proofErr w:type="spellEnd"/>
+      <w:r>
+        <w:rPr>
+          <w:sz w:val="28"/>
+          <w:szCs w:val="28"/>
+        </w:rPr>
+        <w:t>.</w:t>
+      </w:r>
+    </w:p>
+    <w:p>
+      <w:pPr>
+        <w:pStyle w:val="NormalWeb"/>
+        <w:numPr>
+          <w:ilvl w:val="0"/>
+          <w:numId w:val="6"/>
+        </w:numPr>
+        <w:rPr>
+          <w:sz w:val="28"/>
+          <w:szCs w:val="28"/>
+        </w:rPr>
+      </w:pPr>
+      <w:proofErr w:type="spellStart"/>
+      <w:r>
+        <w:rPr>
+          <w:b/>
+          <w:bCs/>
+          <w:sz w:val="28"/>
+          <w:szCs w:val="28"/>
+        </w:rPr>
+        <w:t>Criteria</w:t>
+      </w:r>
+      <w:proofErr w:type="spellEnd"/>
+      <w:r>
+        <w:rPr>
+          <w:b/>
+          <w:bCs/>
+          <w:sz w:val="28"/>
+          <w:szCs w:val="28"/>
+        </w:rPr>
+        <w:t>:</w:t>
+      </w:r>
+      <w:r>
+        <w:rPr>
+          <w:sz w:val="28"/>
+          <w:szCs w:val="28"/>
+        </w:rPr>
+        <w:t xml:space="preserve"> UI </w:t>
+      </w:r>
+      <w:proofErr w:type="spellStart"/>
+      <w:r>
+        <w:rPr>
+          <w:sz w:val="28"/>
+          <w:szCs w:val="28"/>
+        </w:rPr>
+        <w:t>elements</w:t>
+      </w:r>
+      <w:proofErr w:type="spellEnd"/>
+      <w:r>
+        <w:rPr>
+          <w:sz w:val="28"/>
+          <w:szCs w:val="28"/>
+        </w:rPr>
+        <w:t xml:space="preserve"> must </w:t>
+      </w:r>
+      <w:proofErr w:type="spellStart"/>
+      <w:r>
+        <w:rPr>
+          <w:sz w:val="28"/>
+          <w:szCs w:val="28"/>
+        </w:rPr>
+        <w:t>automatically</w:t>
+      </w:r>
+      <w:proofErr w:type="spellEnd"/>
+      <w:r>
+        <w:rPr>
+          <w:sz w:val="28"/>
+          <w:szCs w:val="28"/>
+        </w:rPr>
+        <w:t xml:space="preserve"> </w:t>
+      </w:r>
+      <w:proofErr w:type="spellStart"/>
+      <w:r>
+        <w:rPr>
+          <w:sz w:val="28"/>
+          <w:szCs w:val="28"/>
+        </w:rPr>
+        <w:t>adapt</w:t>
+      </w:r>
+      <w:proofErr w:type="spellEnd"/>
+      <w:r>
+        <w:rPr>
+          <w:sz w:val="28"/>
+          <w:szCs w:val="28"/>
+        </w:rPr>
+        <w:t xml:space="preserve"> </w:t>
+      </w:r>
+      <w:proofErr w:type="spellStart"/>
+      <w:r>
+        <w:rPr>
+          <w:sz w:val="28"/>
+          <w:szCs w:val="28"/>
+        </w:rPr>
+        <w:t>to</w:t>
+      </w:r>
+      <w:proofErr w:type="spellEnd"/>
+      <w:r>
+        <w:rPr>
+          <w:sz w:val="28"/>
+          <w:szCs w:val="28"/>
+        </w:rPr>
+        <w:t xml:space="preserve"> </w:t>
+      </w:r>
+      <w:proofErr w:type="spellStart"/>
+      <w:r>
+        <w:rPr>
+          <w:sz w:val="28"/>
+          <w:szCs w:val="28"/>
+        </w:rPr>
+        <w:t>both</w:t>
+      </w:r>
+      <w:proofErr w:type="spellEnd"/>
+      <w:r>
+        <w:rPr>
+          <w:sz w:val="28"/>
+          <w:szCs w:val="28"/>
+        </w:rPr>
+        <w:t xml:space="preserve"> desktop </w:t>
+      </w:r>
+      <w:proofErr w:type="spellStart"/>
+      <w:r>
+        <w:rPr>
+          <w:sz w:val="28"/>
+          <w:szCs w:val="28"/>
+        </w:rPr>
+        <w:t>monitors</w:t>
+      </w:r>
+      <w:proofErr w:type="spellEnd"/>
+      <w:r>
+        <w:rPr>
+          <w:sz w:val="28"/>
+          <w:szCs w:val="28"/>
+        </w:rPr>
+        <w:t xml:space="preserve"> </w:t>
+      </w:r>
+      <w:proofErr w:type="spellStart"/>
+      <w:r>
+        <w:rPr>
+          <w:sz w:val="28"/>
+          <w:szCs w:val="28"/>
+        </w:rPr>
+        <w:t>and</w:t>
+      </w:r>
+      <w:proofErr w:type="spellEnd"/>
+      <w:r>
+        <w:rPr>
+          <w:sz w:val="28"/>
+          <w:szCs w:val="28"/>
+        </w:rPr>
+        <w:t xml:space="preserve"> mobile </w:t>
+      </w:r>
+      <w:proofErr w:type="spellStart"/>
+      <w:r>
+        <w:rPr>
+          <w:sz w:val="28"/>
+          <w:szCs w:val="28"/>
+        </w:rPr>
+        <w:t>screens</w:t>
+      </w:r>
+      <w:proofErr w:type="spellEnd"/>
+      <w:r>
+        <w:rPr>
+          <w:sz w:val="28"/>
+          <w:szCs w:val="28"/>
+        </w:rPr>
+        <w:t xml:space="preserve">. Core </w:t>
+      </w:r>
+      <w:proofErr w:type="spellStart"/>
+      <w:r>
+        <w:rPr>
+          <w:sz w:val="28"/>
+          <w:szCs w:val="28"/>
+        </w:rPr>
+        <w:t>functionalities</w:t>
+      </w:r>
+      <w:proofErr w:type="spellEnd"/>
+      <w:r>
+        <w:rPr>
+          <w:sz w:val="28"/>
+          <w:szCs w:val="28"/>
+        </w:rPr>
+        <w:t xml:space="preserve"> (</w:t>
+      </w:r>
+      <w:proofErr w:type="spellStart"/>
+      <w:r>
+        <w:rPr>
+          <w:sz w:val="28"/>
+          <w:szCs w:val="28"/>
+        </w:rPr>
+        <w:t>checking</w:t>
+      </w:r>
+      <w:proofErr w:type="spellEnd"/>
+      <w:r>
+        <w:rPr>
+          <w:sz w:val="28"/>
+          <w:szCs w:val="28"/>
+        </w:rPr>
+        <w:t xml:space="preserve"> </w:t>
+      </w:r>
+      <w:proofErr w:type="spellStart"/>
+      <w:r>
+        <w:rPr>
+          <w:sz w:val="28"/>
+          <w:szCs w:val="28"/>
+        </w:rPr>
+        <w:t>tasks</w:t>
+      </w:r>
+      <w:proofErr w:type="spellEnd"/>
+      <w:r>
+        <w:rPr>
+          <w:sz w:val="28"/>
+          <w:szCs w:val="28"/>
+        </w:rPr>
+        <w:t xml:space="preserve">, </w:t>
+      </w:r>
+      <w:proofErr w:type="spellStart"/>
+      <w:r>
+        <w:rPr>
+          <w:sz w:val="28"/>
+          <w:szCs w:val="28"/>
+        </w:rPr>
+        <w:t>viewing</w:t>
+      </w:r>
+      <w:proofErr w:type="spellEnd"/>
+      <w:r>
+        <w:rPr>
+          <w:sz w:val="28"/>
+          <w:szCs w:val="28"/>
+        </w:rPr>
+        <w:t xml:space="preserve"> </w:t>
+      </w:r>
+      <w:proofErr w:type="spellStart"/>
+      <w:r>
+        <w:rPr>
+          <w:sz w:val="28"/>
+          <w:szCs w:val="28"/>
+        </w:rPr>
+        <w:t>guests</w:t>
+      </w:r>
+      <w:proofErr w:type="spellEnd"/>
+      <w:r>
+        <w:rPr>
+          <w:sz w:val="28"/>
+          <w:szCs w:val="28"/>
+        </w:rPr>
+        <w:t xml:space="preserve">) must </w:t>
+      </w:r>
+      <w:proofErr w:type="spellStart"/>
+      <w:r>
+        <w:rPr>
+          <w:sz w:val="28"/>
+          <w:szCs w:val="28"/>
+        </w:rPr>
+        <w:t>be</w:t>
+      </w:r>
+      <w:proofErr w:type="spellEnd"/>
+      <w:r>
+        <w:rPr>
+          <w:sz w:val="28"/>
+          <w:szCs w:val="28"/>
+        </w:rPr>
+        <w:t xml:space="preserve"> </w:t>
+      </w:r>
+      <w:proofErr w:type="spellStart"/>
+      <w:r>
+        <w:rPr>
+          <w:sz w:val="28"/>
+          <w:szCs w:val="28"/>
+        </w:rPr>
+        <w:t>accessible</w:t>
+      </w:r>
+      <w:proofErr w:type="spellEnd"/>
+      <w:r>
+        <w:rPr>
+          <w:sz w:val="28"/>
+          <w:szCs w:val="28"/>
+        </w:rPr>
+        <w:t xml:space="preserve"> on </w:t>
+      </w:r>
+      <w:proofErr w:type="spellStart"/>
+      <w:r>
+        <w:rPr>
+          <w:sz w:val="28"/>
+          <w:szCs w:val="28"/>
+        </w:rPr>
+        <w:t>smartphones</w:t>
+      </w:r>
+      <w:proofErr w:type="spellEnd"/>
+      <w:r>
+        <w:rPr>
+          <w:sz w:val="28"/>
+          <w:szCs w:val="28"/>
+        </w:rPr>
+        <w:t xml:space="preserve"> </w:t>
+      </w:r>
+      <w:proofErr w:type="spellStart"/>
+      <w:r>
+        <w:rPr>
+          <w:sz w:val="28"/>
+          <w:szCs w:val="28"/>
+        </w:rPr>
+        <w:t>without</w:t>
+      </w:r>
+      <w:proofErr w:type="spellEnd"/>
+      <w:r>
+        <w:rPr>
+          <w:sz w:val="28"/>
+          <w:szCs w:val="28"/>
+        </w:rPr>
+        <w:t xml:space="preserve"> </w:t>
+      </w:r>
+      <w:proofErr w:type="spellStart"/>
+      <w:r>
+        <w:rPr>
+          <w:sz w:val="28"/>
+          <w:szCs w:val="28"/>
+        </w:rPr>
+        <w:t>horizontal</w:t>
+      </w:r>
+      <w:proofErr w:type="spellEnd"/>
+      <w:r>
+        <w:rPr>
+          <w:sz w:val="28"/>
+          <w:szCs w:val="28"/>
+        </w:rPr>
+        <w:t xml:space="preserve"> </w:t>
+      </w:r>
+      <w:proofErr w:type="spellStart"/>
+      <w:r>
+        <w:rPr>
+          <w:sz w:val="28"/>
+          <w:szCs w:val="28"/>
+        </w:rPr>
+        <w:t>scrolling</w:t>
+      </w:r>
+      <w:proofErr w:type="spellEnd"/>
+      <w:r>
+        <w:rPr>
+          <w:sz w:val="28"/>
+          <w:szCs w:val="28"/>
+        </w:rPr>
+        <w:t>.</w:t>
+      </w:r>
+    </w:p>
+    <w:p>
+      <w:pPr>
+        <w:pStyle w:val="NormalWeb"/>
+        <w:numPr>
+          <w:ilvl w:val="0"/>
+          <w:numId w:val="6"/>
+        </w:numPr>
+        <w:rPr>
+          <w:sz w:val="28"/>
+          <w:szCs w:val="28"/>
+        </w:rPr>
+      </w:pPr>
+      <w:proofErr w:type="spellStart"/>
+      <w:r>
+        <w:rPr>
+          <w:b/>
+          <w:bCs/>
+          <w:sz w:val="28"/>
+          <w:szCs w:val="28"/>
+        </w:rPr>
+        <w:t>Priority</w:t>
+      </w:r>
+      <w:proofErr w:type="spellEnd"/>
+      <w:r>
+        <w:rPr>
+          <w:b/>
+          <w:bCs/>
+          <w:sz w:val="28"/>
+          <w:szCs w:val="28"/>
+        </w:rPr>
+        <w:t>:</w:t>
+      </w:r>
+      <w:r>
+        <w:rPr>
+          <w:sz w:val="28"/>
+          <w:szCs w:val="28"/>
+        </w:rPr>
+        <w:t xml:space="preserve"> </w:t>
+      </w:r>
+      <w:proofErr w:type="spellStart"/>
+      <w:r>
+        <w:rPr>
+          <w:sz w:val="28"/>
+          <w:szCs w:val="28"/>
+        </w:rPr>
+        <w:t>High</w:t>
+      </w:r>
+      <w:proofErr w:type="spellEnd"/>
+    </w:p>
+    <w:p>
+      <w:pPr>
+        <w:pStyle w:val="NormalWeb"/>
+        <w:numPr>
+          <w:ilvl w:val="0"/>
+          <w:numId w:val="6"/>
+        </w:numPr>
+        <w:rPr>
+          <w:sz w:val="28"/>
+          <w:szCs w:val="28"/>
+        </w:rPr>
+      </w:pPr>
+      <w:proofErr w:type="spellStart"/>
+      <w:r>
+        <w:rPr>
+          <w:b/>
+          <w:bCs/>
+          <w:sz w:val="28"/>
+          <w:szCs w:val="28"/>
+        </w:rPr>
+        <w:t>Rationale</w:t>
+      </w:r>
+      <w:proofErr w:type="spellEnd"/>
+      <w:r>
+        <w:rPr>
+          <w:b/>
+          <w:bCs/>
+          <w:sz w:val="28"/>
+          <w:szCs w:val="28"/>
+        </w:rPr>
+        <w:t>:</w:t>
+      </w:r>
+      <w:r>
+        <w:rPr>
+          <w:sz w:val="28"/>
+          <w:szCs w:val="28"/>
+        </w:rPr>
+        <w:t xml:space="preserve"> Event </w:t>
+      </w:r>
+      <w:proofErr w:type="spellStart"/>
+      <w:r>
+        <w:rPr>
+          <w:sz w:val="28"/>
+          <w:szCs w:val="28"/>
+        </w:rPr>
+        <w:t>organizers</w:t>
+      </w:r>
+      <w:proofErr w:type="spellEnd"/>
+      <w:r>
+        <w:rPr>
+          <w:sz w:val="28"/>
+          <w:szCs w:val="28"/>
+        </w:rPr>
+        <w:t xml:space="preserve"> are </w:t>
+      </w:r>
+      <w:proofErr w:type="spellStart"/>
+      <w:r>
+        <w:rPr>
+          <w:sz w:val="28"/>
+          <w:szCs w:val="28"/>
+        </w:rPr>
+        <w:t>often</w:t>
+      </w:r>
+      <w:proofErr w:type="spellEnd"/>
+      <w:r>
+        <w:rPr>
+          <w:sz w:val="28"/>
+          <w:szCs w:val="28"/>
+        </w:rPr>
+        <w:t xml:space="preserve"> on </w:t>
+      </w:r>
+      <w:proofErr w:type="spellStart"/>
+      <w:r>
+        <w:rPr>
+          <w:sz w:val="28"/>
+          <w:szCs w:val="28"/>
+        </w:rPr>
+        <w:t>the</w:t>
+      </w:r>
+      <w:proofErr w:type="spellEnd"/>
+      <w:r>
+        <w:rPr>
+          <w:sz w:val="28"/>
+          <w:szCs w:val="28"/>
+        </w:rPr>
+        <w:t xml:space="preserve"> </w:t>
+      </w:r>
+      <w:proofErr w:type="spellStart"/>
+      <w:r>
+        <w:rPr>
+          <w:sz w:val="28"/>
+          <w:szCs w:val="28"/>
+        </w:rPr>
+        <w:t>move</w:t>
+      </w:r>
+      <w:proofErr w:type="spellEnd"/>
+      <w:r>
+        <w:rPr>
+          <w:sz w:val="28"/>
+          <w:szCs w:val="28"/>
+        </w:rPr>
+        <w:t xml:space="preserve"> </w:t>
+      </w:r>
+      <w:proofErr w:type="spellStart"/>
+      <w:r>
+        <w:rPr>
+          <w:sz w:val="28"/>
+          <w:szCs w:val="28"/>
+        </w:rPr>
+        <w:t>and</w:t>
+      </w:r>
+      <w:proofErr w:type="spellEnd"/>
+      <w:r>
+        <w:rPr>
+          <w:sz w:val="28"/>
+          <w:szCs w:val="28"/>
+        </w:rPr>
+        <w:t xml:space="preserve"> </w:t>
+      </w:r>
+      <w:proofErr w:type="spellStart"/>
+      <w:r>
+        <w:rPr>
+          <w:sz w:val="28"/>
+          <w:szCs w:val="28"/>
+        </w:rPr>
+        <w:t>need</w:t>
+      </w:r>
+      <w:proofErr w:type="spellEnd"/>
+      <w:r>
+        <w:rPr>
+          <w:sz w:val="28"/>
+          <w:szCs w:val="28"/>
+        </w:rPr>
+        <w:t xml:space="preserve"> </w:t>
+      </w:r>
+      <w:proofErr w:type="spellStart"/>
+      <w:r>
+        <w:rPr>
+          <w:sz w:val="28"/>
+          <w:szCs w:val="28"/>
+        </w:rPr>
+        <w:t>to</w:t>
+      </w:r>
+      <w:proofErr w:type="spellEnd"/>
+      <w:r>
+        <w:rPr>
+          <w:sz w:val="28"/>
+          <w:szCs w:val="28"/>
+        </w:rPr>
+        <w:t xml:space="preserve"> </w:t>
+      </w:r>
+      <w:proofErr w:type="spellStart"/>
+      <w:r>
+        <w:rPr>
+          <w:sz w:val="28"/>
+          <w:szCs w:val="28"/>
+        </w:rPr>
+        <w:t>check</w:t>
+      </w:r>
+      <w:proofErr w:type="spellEnd"/>
+      <w:r>
+        <w:rPr>
+          <w:sz w:val="28"/>
+          <w:szCs w:val="28"/>
+        </w:rPr>
+        <w:t xml:space="preserve"> </w:t>
+      </w:r>
+      <w:proofErr w:type="spellStart"/>
+      <w:r>
+        <w:rPr>
+          <w:sz w:val="28"/>
+          <w:szCs w:val="28"/>
+        </w:rPr>
+        <w:t>guest</w:t>
+      </w:r>
+      <w:proofErr w:type="spellEnd"/>
+      <w:r>
+        <w:rPr>
+          <w:sz w:val="28"/>
+          <w:szCs w:val="28"/>
+        </w:rPr>
+        <w:t xml:space="preserve"> </w:t>
+      </w:r>
+      <w:proofErr w:type="spellStart"/>
+      <w:r>
+        <w:rPr>
+          <w:sz w:val="28"/>
+          <w:szCs w:val="28"/>
+        </w:rPr>
+        <w:t>lists</w:t>
+      </w:r>
+      <w:proofErr w:type="spellEnd"/>
+      <w:r>
+        <w:rPr>
+          <w:sz w:val="28"/>
+          <w:szCs w:val="28"/>
+        </w:rPr>
+        <w:t xml:space="preserve">, </w:t>
+      </w:r>
+      <w:proofErr w:type="spellStart"/>
+      <w:r>
+        <w:rPr>
+          <w:sz w:val="28"/>
+          <w:szCs w:val="28"/>
+        </w:rPr>
+        <w:t>tasks</w:t>
+      </w:r>
+      <w:proofErr w:type="spellEnd"/>
+      <w:r>
+        <w:rPr>
+          <w:sz w:val="28"/>
+          <w:szCs w:val="28"/>
+        </w:rPr>
+        <w:t xml:space="preserve">, or </w:t>
+      </w:r>
+      <w:proofErr w:type="spellStart"/>
+      <w:r>
+        <w:rPr>
+          <w:sz w:val="28"/>
+          <w:szCs w:val="28"/>
+        </w:rPr>
+        <w:t>budgets</w:t>
+      </w:r>
+      <w:proofErr w:type="spellEnd"/>
+      <w:r>
+        <w:rPr>
+          <w:sz w:val="28"/>
+          <w:szCs w:val="28"/>
+        </w:rPr>
+        <w:t xml:space="preserve"> </w:t>
+      </w:r>
+      <w:proofErr w:type="spellStart"/>
+      <w:r>
+        <w:rPr>
+          <w:sz w:val="28"/>
+          <w:szCs w:val="28"/>
+        </w:rPr>
+        <w:t>directly</w:t>
+      </w:r>
+      <w:proofErr w:type="spellEnd"/>
+      <w:r>
+        <w:rPr>
+          <w:sz w:val="28"/>
+          <w:szCs w:val="28"/>
+        </w:rPr>
+        <w:t xml:space="preserve"> </w:t>
+      </w:r>
+      <w:proofErr w:type="spellStart"/>
+      <w:r>
+        <w:rPr>
+          <w:sz w:val="28"/>
+          <w:szCs w:val="28"/>
+        </w:rPr>
+        <w:t>from</w:t>
+      </w:r>
+      <w:proofErr w:type="spellEnd"/>
+      <w:r>
+        <w:rPr>
+          <w:sz w:val="28"/>
+          <w:szCs w:val="28"/>
+        </w:rPr>
+        <w:t xml:space="preserve"> </w:t>
+      </w:r>
+      <w:proofErr w:type="spellStart"/>
+      <w:r>
+        <w:rPr>
+          <w:sz w:val="28"/>
+          <w:szCs w:val="28"/>
+        </w:rPr>
+        <w:t>their</w:t>
+      </w:r>
+      <w:proofErr w:type="spellEnd"/>
+      <w:r>
+        <w:rPr>
+          <w:sz w:val="28"/>
+          <w:szCs w:val="28"/>
+        </w:rPr>
+        <w:t xml:space="preserve"> </w:t>
+      </w:r>
+      <w:proofErr w:type="spellStart"/>
+      <w:r>
+        <w:rPr>
+          <w:sz w:val="28"/>
+          <w:szCs w:val="28"/>
+        </w:rPr>
+        <w:t>phones</w:t>
+      </w:r>
+      <w:proofErr w:type="spellEnd"/>
+      <w:r>
+        <w:rPr>
+          <w:sz w:val="28"/>
+          <w:szCs w:val="28"/>
+        </w:rPr>
+        <w:t xml:space="preserve"> </w:t>
+      </w:r>
+      <w:proofErr w:type="spellStart"/>
+      <w:r>
+        <w:rPr>
+          <w:sz w:val="28"/>
+          <w:szCs w:val="28"/>
+        </w:rPr>
+        <w:t>during</w:t>
+      </w:r>
+      <w:proofErr w:type="spellEnd"/>
+      <w:r>
+        <w:rPr>
+          <w:sz w:val="28"/>
+          <w:szCs w:val="28"/>
+        </w:rPr>
+        <w:t xml:space="preserve"> </w:t>
+      </w:r>
+      <w:proofErr w:type="spellStart"/>
+      <w:r>
+        <w:rPr>
+          <w:sz w:val="28"/>
+          <w:szCs w:val="28"/>
+        </w:rPr>
+        <w:t>the</w:t>
+      </w:r>
+      <w:proofErr w:type="spellEnd"/>
+      <w:r>
+        <w:rPr>
+          <w:sz w:val="28"/>
+          <w:szCs w:val="28"/>
+        </w:rPr>
+        <w:t xml:space="preserve"> actual event.</w:t>
+      </w:r>
+    </w:p>
+    <w:p>
+      <w:pPr>
+        <w:pStyle w:val="NormalWeb"/>
+        <w:rPr>
+          <w:sz w:val="28"/>
+          <w:szCs w:val="28"/>
+        </w:rPr>
+      </w:pPr>
+      <w:r>
+        <w:rPr>
+          <w:b/>
+          <w:bCs/>
+          <w:sz w:val="28"/>
+          <w:szCs w:val="28"/>
+        </w:rPr>
+        <w:t xml:space="preserve">NFR-4: Data </w:t>
+      </w:r>
+      <w:proofErr w:type="spellStart"/>
+      <w:r>
+        <w:rPr>
+          <w:b/>
+          <w:bCs/>
+          <w:sz w:val="28"/>
+          <w:szCs w:val="28"/>
+        </w:rPr>
+        <w:t>Consistency</w:t>
+      </w:r>
+      <w:proofErr w:type="spellEnd"/>
+      <w:r>
+        <w:rPr>
+          <w:b/>
+          <w:bCs/>
+          <w:sz w:val="28"/>
+          <w:szCs w:val="28"/>
+        </w:rPr>
+        <w:t xml:space="preserve"> &amp; </w:t>
+      </w:r>
+      <w:proofErr w:type="spellStart"/>
+      <w:r>
+        <w:rPr>
+          <w:b/>
+          <w:bCs/>
+          <w:sz w:val="28"/>
+          <w:szCs w:val="28"/>
+        </w:rPr>
+        <w:t>Validation</w:t>
+      </w:r>
+      <w:proofErr w:type="spellEnd"/>
+    </w:p>
+    <w:p>
+      <w:pPr>
+        <w:pStyle w:val="NormalWeb"/>
+        <w:numPr>
+          <w:ilvl w:val="0"/>
+          <w:numId w:val="7"/>
+        </w:numPr>
+        <w:rPr>
+          <w:sz w:val="28"/>
+          <w:szCs w:val="28"/>
+        </w:rPr>
+      </w:pPr>
+      <w:proofErr w:type="spellStart"/>
+      <w:r>
+        <w:rPr>
+          <w:b/>
+          <w:bCs/>
+          <w:sz w:val="28"/>
+          <w:szCs w:val="28"/>
+        </w:rPr>
+        <w:t>Description</w:t>
+      </w:r>
+      <w:proofErr w:type="spellEnd"/>
+      <w:r>
+        <w:rPr>
+          <w:b/>
+          <w:bCs/>
+          <w:sz w:val="28"/>
+          <w:szCs w:val="28"/>
+        </w:rPr>
+        <w:t>:</w:t>
+      </w:r>
+      <w:r>
+        <w:rPr>
+          <w:sz w:val="28"/>
+          <w:szCs w:val="28"/>
+        </w:rPr>
+        <w:t xml:space="preserve"> The </w:t>
+      </w:r>
+      <w:proofErr w:type="spellStart"/>
+      <w:r>
+        <w:rPr>
+          <w:sz w:val="28"/>
+          <w:szCs w:val="28"/>
+        </w:rPr>
+        <w:t>system</w:t>
+      </w:r>
+      <w:proofErr w:type="spellEnd"/>
+      <w:r>
+        <w:rPr>
+          <w:sz w:val="28"/>
+          <w:szCs w:val="28"/>
+        </w:rPr>
+        <w:t xml:space="preserve"> </w:t>
+      </w:r>
+      <w:proofErr w:type="spellStart"/>
+      <w:r>
+        <w:rPr>
+          <w:sz w:val="28"/>
+          <w:szCs w:val="28"/>
+        </w:rPr>
+        <w:t>shall</w:t>
+      </w:r>
+      <w:proofErr w:type="spellEnd"/>
+      <w:r>
+        <w:rPr>
+          <w:sz w:val="28"/>
+          <w:szCs w:val="28"/>
+        </w:rPr>
+        <w:t xml:space="preserve"> </w:t>
+      </w:r>
+      <w:proofErr w:type="spellStart"/>
+      <w:r>
+        <w:rPr>
+          <w:sz w:val="28"/>
+          <w:szCs w:val="28"/>
+        </w:rPr>
+        <w:t>maintain</w:t>
+      </w:r>
+      <w:proofErr w:type="spellEnd"/>
+      <w:r>
+        <w:rPr>
+          <w:sz w:val="28"/>
+          <w:szCs w:val="28"/>
+        </w:rPr>
+        <w:t xml:space="preserve"> strict data </w:t>
+      </w:r>
+      <w:proofErr w:type="spellStart"/>
+      <w:r>
+        <w:rPr>
+          <w:sz w:val="28"/>
+          <w:szCs w:val="28"/>
+        </w:rPr>
+        <w:t>consistency</w:t>
+      </w:r>
+      <w:proofErr w:type="spellEnd"/>
+      <w:r>
+        <w:rPr>
+          <w:sz w:val="28"/>
+          <w:szCs w:val="28"/>
+        </w:rPr>
+        <w:t xml:space="preserve"> for </w:t>
+      </w:r>
+      <w:proofErr w:type="spellStart"/>
+      <w:r>
+        <w:rPr>
+          <w:sz w:val="28"/>
+          <w:szCs w:val="28"/>
+        </w:rPr>
+        <w:t>all</w:t>
+      </w:r>
+      <w:proofErr w:type="spellEnd"/>
+      <w:r>
+        <w:rPr>
+          <w:sz w:val="28"/>
+          <w:szCs w:val="28"/>
+        </w:rPr>
+        <w:t xml:space="preserve"> event </w:t>
+      </w:r>
+      <w:proofErr w:type="spellStart"/>
+      <w:r>
+        <w:rPr>
+          <w:sz w:val="28"/>
+          <w:szCs w:val="28"/>
+        </w:rPr>
+        <w:t>operations</w:t>
+      </w:r>
+      <w:proofErr w:type="spellEnd"/>
+      <w:r>
+        <w:rPr>
+          <w:sz w:val="28"/>
+          <w:szCs w:val="28"/>
+        </w:rPr>
+        <w:t>.</w:t>
+      </w:r>
+    </w:p>
+    <w:p>
+      <w:pPr>
+        <w:pStyle w:val="NormalWeb"/>
+        <w:numPr>
+          <w:ilvl w:val="0"/>
+          <w:numId w:val="7"/>
+        </w:numPr>
+        <w:rPr>
+          <w:sz w:val="28"/>
+          <w:szCs w:val="28"/>
+        </w:rPr>
+      </w:pPr>
+      <w:proofErr w:type="spellStart"/>
+      <w:r>
+        <w:rPr>
+          <w:b/>
+          <w:bCs/>
+          <w:sz w:val="28"/>
+          <w:szCs w:val="28"/>
+        </w:rPr>
+        <w:t>Criteria</w:t>
+      </w:r>
+      <w:proofErr w:type="spellEnd"/>
+      <w:r>
+        <w:rPr>
+          <w:b/>
+          <w:bCs/>
+          <w:sz w:val="28"/>
+          <w:szCs w:val="28"/>
+        </w:rPr>
+        <w:t>:</w:t>
+      </w:r>
+      <w:r>
+        <w:rPr>
+          <w:sz w:val="28"/>
+          <w:szCs w:val="28"/>
+        </w:rPr>
+        <w:t xml:space="preserve"> </w:t>
+      </w:r>
+      <w:proofErr w:type="spellStart"/>
+      <w:r>
+        <w:rPr>
+          <w:sz w:val="28"/>
+          <w:szCs w:val="28"/>
+        </w:rPr>
+        <w:t>Backend</w:t>
+      </w:r>
+      <w:proofErr w:type="spellEnd"/>
+      <w:r>
+        <w:rPr>
+          <w:sz w:val="28"/>
+          <w:szCs w:val="28"/>
+        </w:rPr>
+        <w:t xml:space="preserve"> </w:t>
+      </w:r>
+      <w:proofErr w:type="spellStart"/>
+      <w:r>
+        <w:rPr>
+          <w:sz w:val="28"/>
+          <w:szCs w:val="28"/>
+        </w:rPr>
+        <w:t>validation</w:t>
+      </w:r>
+      <w:proofErr w:type="spellEnd"/>
+      <w:r>
+        <w:rPr>
+          <w:sz w:val="28"/>
+          <w:szCs w:val="28"/>
+        </w:rPr>
+        <w:t xml:space="preserve"> must </w:t>
+      </w:r>
+      <w:proofErr w:type="spellStart"/>
+      <w:r>
+        <w:rPr>
+          <w:sz w:val="28"/>
+          <w:szCs w:val="28"/>
+        </w:rPr>
+        <w:t>strictly</w:t>
+      </w:r>
+      <w:proofErr w:type="spellEnd"/>
+      <w:r>
+        <w:rPr>
+          <w:sz w:val="28"/>
+          <w:szCs w:val="28"/>
+        </w:rPr>
+        <w:t xml:space="preserve"> </w:t>
+      </w:r>
+      <w:proofErr w:type="spellStart"/>
+      <w:r>
+        <w:rPr>
+          <w:sz w:val="28"/>
+          <w:szCs w:val="28"/>
+        </w:rPr>
+        <w:t>prevent</w:t>
+      </w:r>
+      <w:proofErr w:type="spellEnd"/>
+      <w:r>
+        <w:rPr>
+          <w:sz w:val="28"/>
+          <w:szCs w:val="28"/>
+        </w:rPr>
+        <w:t xml:space="preserve"> </w:t>
+      </w:r>
+      <w:proofErr w:type="spellStart"/>
+      <w:r>
+        <w:rPr>
+          <w:sz w:val="28"/>
+          <w:szCs w:val="28"/>
+        </w:rPr>
+        <w:t>assigning</w:t>
+      </w:r>
+      <w:proofErr w:type="spellEnd"/>
+      <w:r>
+        <w:rPr>
+          <w:sz w:val="28"/>
+          <w:szCs w:val="28"/>
+        </w:rPr>
+        <w:t xml:space="preserve"> a </w:t>
+      </w:r>
+      <w:proofErr w:type="spellStart"/>
+      <w:r>
+        <w:rPr>
+          <w:sz w:val="28"/>
+          <w:szCs w:val="28"/>
+        </w:rPr>
+        <w:t>guest</w:t>
+      </w:r>
+      <w:proofErr w:type="spellEnd"/>
+      <w:r>
+        <w:rPr>
+          <w:sz w:val="28"/>
+          <w:szCs w:val="28"/>
+        </w:rPr>
+        <w:t xml:space="preserve"> </w:t>
+      </w:r>
+      <w:proofErr w:type="spellStart"/>
+      <w:r>
+        <w:rPr>
+          <w:sz w:val="28"/>
+          <w:szCs w:val="28"/>
+        </w:rPr>
+        <w:t>to</w:t>
+      </w:r>
+      <w:proofErr w:type="spellEnd"/>
+      <w:r>
+        <w:rPr>
+          <w:sz w:val="28"/>
+          <w:szCs w:val="28"/>
+        </w:rPr>
+        <w:t xml:space="preserve"> a table </w:t>
+      </w:r>
+      <w:proofErr w:type="spellStart"/>
+      <w:r>
+        <w:rPr>
+          <w:sz w:val="28"/>
+          <w:szCs w:val="28"/>
+        </w:rPr>
+        <w:t>that</w:t>
+      </w:r>
+      <w:proofErr w:type="spellEnd"/>
+      <w:r>
+        <w:rPr>
+          <w:sz w:val="28"/>
+          <w:szCs w:val="28"/>
+        </w:rPr>
+        <w:t xml:space="preserve"> </w:t>
+      </w:r>
+      <w:proofErr w:type="spellStart"/>
+      <w:r>
+        <w:rPr>
+          <w:sz w:val="28"/>
+          <w:szCs w:val="28"/>
+        </w:rPr>
+        <w:t>has</w:t>
+      </w:r>
+      <w:proofErr w:type="spellEnd"/>
+      <w:r>
+        <w:rPr>
+          <w:sz w:val="28"/>
+          <w:szCs w:val="28"/>
+        </w:rPr>
+        <w:t xml:space="preserve"> </w:t>
+      </w:r>
+      <w:proofErr w:type="spellStart"/>
+      <w:r>
+        <w:rPr>
+          <w:sz w:val="28"/>
+          <w:szCs w:val="28"/>
+        </w:rPr>
+        <w:t>reached</w:t>
+      </w:r>
+      <w:proofErr w:type="spellEnd"/>
+      <w:r>
+        <w:rPr>
+          <w:sz w:val="28"/>
+          <w:szCs w:val="28"/>
+        </w:rPr>
+        <w:t xml:space="preserve"> </w:t>
+      </w:r>
+      <w:proofErr w:type="spellStart"/>
+      <w:r>
+        <w:rPr>
+          <w:sz w:val="28"/>
+          <w:szCs w:val="28"/>
+        </w:rPr>
+        <w:t>its</w:t>
+      </w:r>
+      <w:proofErr w:type="spellEnd"/>
+      <w:r>
+        <w:rPr>
+          <w:sz w:val="28"/>
+          <w:szCs w:val="28"/>
+        </w:rPr>
+        <w:t xml:space="preserve"> maximum </w:t>
+      </w:r>
+      <w:proofErr w:type="spellStart"/>
+      <w:r>
+        <w:rPr>
+          <w:sz w:val="28"/>
+          <w:szCs w:val="28"/>
+        </w:rPr>
+        <w:t>capacity</w:t>
+      </w:r>
+      <w:proofErr w:type="spellEnd"/>
+      <w:r>
+        <w:rPr>
+          <w:sz w:val="28"/>
+          <w:szCs w:val="28"/>
+        </w:rPr>
+        <w:t xml:space="preserve">. Financial </w:t>
+      </w:r>
+      <w:proofErr w:type="spellStart"/>
+      <w:r>
+        <w:rPr>
+          <w:sz w:val="28"/>
+          <w:szCs w:val="28"/>
+        </w:rPr>
+        <w:t>calculations</w:t>
+      </w:r>
+      <w:proofErr w:type="spellEnd"/>
+      <w:r>
+        <w:rPr>
+          <w:sz w:val="28"/>
+          <w:szCs w:val="28"/>
+        </w:rPr>
+        <w:t xml:space="preserve"> must </w:t>
+      </w:r>
+      <w:proofErr w:type="spellStart"/>
+      <w:r>
+        <w:rPr>
+          <w:sz w:val="28"/>
+          <w:szCs w:val="28"/>
+        </w:rPr>
+        <w:t>use</w:t>
+      </w:r>
+      <w:proofErr w:type="spellEnd"/>
+      <w:r>
+        <w:rPr>
+          <w:sz w:val="28"/>
+          <w:szCs w:val="28"/>
+        </w:rPr>
+        <w:t xml:space="preserve"> atomic </w:t>
+      </w:r>
+      <w:proofErr w:type="spellStart"/>
+      <w:r>
+        <w:rPr>
+          <w:sz w:val="28"/>
+          <w:szCs w:val="28"/>
+        </w:rPr>
+        <w:t>transactions</w:t>
+      </w:r>
+      <w:proofErr w:type="spellEnd"/>
+      <w:r>
+        <w:rPr>
+          <w:sz w:val="28"/>
+          <w:szCs w:val="28"/>
+        </w:rPr>
+        <w:t xml:space="preserve"> </w:t>
+      </w:r>
+      <w:proofErr w:type="spellStart"/>
+      <w:r>
+        <w:rPr>
+          <w:sz w:val="28"/>
+          <w:szCs w:val="28"/>
+        </w:rPr>
+        <w:t>to</w:t>
+      </w:r>
+      <w:proofErr w:type="spellEnd"/>
+      <w:r>
+        <w:rPr>
+          <w:sz w:val="28"/>
+          <w:szCs w:val="28"/>
+        </w:rPr>
+        <w:t xml:space="preserve"> </w:t>
+      </w:r>
+      <w:proofErr w:type="spellStart"/>
+      <w:r>
+        <w:rPr>
+          <w:sz w:val="28"/>
+          <w:szCs w:val="28"/>
+        </w:rPr>
+        <w:t>prevent</w:t>
+      </w:r>
+      <w:proofErr w:type="spellEnd"/>
+      <w:r>
+        <w:rPr>
+          <w:sz w:val="28"/>
+          <w:szCs w:val="28"/>
+        </w:rPr>
+        <w:t xml:space="preserve"> budget </w:t>
+      </w:r>
+      <w:proofErr w:type="spellStart"/>
+      <w:r>
+        <w:rPr>
+          <w:sz w:val="28"/>
+          <w:szCs w:val="28"/>
+        </w:rPr>
+        <w:t>errors</w:t>
+      </w:r>
+      <w:proofErr w:type="spellEnd"/>
+      <w:r>
+        <w:rPr>
+          <w:sz w:val="28"/>
+          <w:szCs w:val="28"/>
+        </w:rPr>
+        <w:t>.</w:t>
+      </w:r>
+    </w:p>
+    <w:p>
+      <w:pPr>
+        <w:pStyle w:val="NormalWeb"/>
+        <w:numPr>
+          <w:ilvl w:val="0"/>
+          <w:numId w:val="7"/>
+        </w:numPr>
+        <w:rPr>
+          <w:sz w:val="28"/>
+          <w:szCs w:val="28"/>
+        </w:rPr>
+      </w:pPr>
+      <w:proofErr w:type="spellStart"/>
+      <w:r>
+        <w:rPr>
+          <w:b/>
+          <w:bCs/>
+          <w:sz w:val="28"/>
+          <w:szCs w:val="28"/>
+        </w:rPr>
+        <w:t>Priority</w:t>
+      </w:r>
+      <w:proofErr w:type="spellEnd"/>
+      <w:r>
+        <w:rPr>
+          <w:b/>
+          <w:bCs/>
+          <w:sz w:val="28"/>
+          <w:szCs w:val="28"/>
+        </w:rPr>
+        <w:t>:</w:t>
+      </w:r>
+      <w:r>
+        <w:rPr>
+          <w:sz w:val="28"/>
+          <w:szCs w:val="28"/>
+        </w:rPr>
+        <w:t xml:space="preserve"> </w:t>
+      </w:r>
+      <w:proofErr w:type="spellStart"/>
+      <w:r>
+        <w:rPr>
+          <w:sz w:val="28"/>
+          <w:szCs w:val="28"/>
+        </w:rPr>
+        <w:t>Critical</w:t>
+      </w:r>
+      <w:proofErr w:type="spellEnd"/>
+    </w:p>
+    <w:p>
+      <w:pPr>
+        <w:pStyle w:val="NormalWeb"/>
+        <w:numPr>
+          <w:ilvl w:val="0"/>
+          <w:numId w:val="7"/>
+        </w:numPr>
+        <w:rPr>
+          <w:sz w:val="28"/>
+          <w:szCs w:val="28"/>
+        </w:rPr>
+      </w:pPr>
+      <w:proofErr w:type="spellStart"/>
+      <w:r>
+        <w:rPr>
+          <w:b/>
+          <w:bCs/>
+          <w:sz w:val="28"/>
+          <w:szCs w:val="28"/>
+        </w:rPr>
+        <w:t>Rationale</w:t>
+      </w:r>
+      <w:proofErr w:type="spellEnd"/>
+      <w:r>
+        <w:rPr>
+          <w:b/>
+          <w:bCs/>
+          <w:sz w:val="28"/>
+          <w:szCs w:val="28"/>
+        </w:rPr>
+        <w:t>:</w:t>
+      </w:r>
+      <w:r>
+        <w:rPr>
+          <w:sz w:val="28"/>
+          <w:szCs w:val="28"/>
+        </w:rPr>
+        <w:t xml:space="preserve"> </w:t>
+      </w:r>
+      <w:proofErr w:type="spellStart"/>
+      <w:r>
+        <w:rPr>
+          <w:sz w:val="28"/>
+          <w:szCs w:val="28"/>
+        </w:rPr>
+        <w:t>Ensure</w:t>
+      </w:r>
+      <w:proofErr w:type="spellEnd"/>
+      <w:r>
+        <w:rPr>
+          <w:sz w:val="28"/>
+          <w:szCs w:val="28"/>
+        </w:rPr>
+        <w:t xml:space="preserve"> a </w:t>
+      </w:r>
+      <w:proofErr w:type="spellStart"/>
+      <w:r>
+        <w:rPr>
+          <w:sz w:val="28"/>
+          <w:szCs w:val="28"/>
+        </w:rPr>
+        <w:t>reliable</w:t>
+      </w:r>
+      <w:proofErr w:type="spellEnd"/>
+      <w:r>
+        <w:rPr>
+          <w:sz w:val="28"/>
+          <w:szCs w:val="28"/>
+        </w:rPr>
+        <w:t xml:space="preserve"> </w:t>
+      </w:r>
+      <w:proofErr w:type="spellStart"/>
+      <w:r>
+        <w:rPr>
+          <w:sz w:val="28"/>
+          <w:szCs w:val="28"/>
+        </w:rPr>
+        <w:t>system</w:t>
+      </w:r>
+      <w:proofErr w:type="spellEnd"/>
+      <w:r>
+        <w:rPr>
+          <w:sz w:val="28"/>
+          <w:szCs w:val="28"/>
+        </w:rPr>
+        <w:t xml:space="preserve"> state </w:t>
+      </w:r>
+      <w:proofErr w:type="spellStart"/>
+      <w:r>
+        <w:rPr>
+          <w:sz w:val="28"/>
+          <w:szCs w:val="28"/>
+        </w:rPr>
+        <w:t>so</w:t>
+      </w:r>
+      <w:proofErr w:type="spellEnd"/>
+      <w:r>
+        <w:rPr>
+          <w:sz w:val="28"/>
+          <w:szCs w:val="28"/>
+        </w:rPr>
+        <w:t xml:space="preserve"> </w:t>
+      </w:r>
+      <w:proofErr w:type="spellStart"/>
+      <w:r>
+        <w:rPr>
+          <w:sz w:val="28"/>
+          <w:szCs w:val="28"/>
+        </w:rPr>
+        <w:t>the</w:t>
+      </w:r>
+      <w:proofErr w:type="spellEnd"/>
+      <w:r>
+        <w:rPr>
+          <w:sz w:val="28"/>
+          <w:szCs w:val="28"/>
+        </w:rPr>
+        <w:t xml:space="preserve"> </w:t>
+      </w:r>
+      <w:proofErr w:type="spellStart"/>
+      <w:r>
+        <w:rPr>
+          <w:sz w:val="28"/>
+          <w:szCs w:val="28"/>
+        </w:rPr>
+        <w:t>organizer</w:t>
+      </w:r>
+      <w:proofErr w:type="spellEnd"/>
+      <w:r>
+        <w:rPr>
+          <w:sz w:val="28"/>
+          <w:szCs w:val="28"/>
+        </w:rPr>
+        <w:t xml:space="preserve"> </w:t>
+      </w:r>
+      <w:proofErr w:type="spellStart"/>
+      <w:r>
+        <w:rPr>
+          <w:sz w:val="28"/>
+          <w:szCs w:val="28"/>
+        </w:rPr>
+        <w:t>does</w:t>
+      </w:r>
+      <w:proofErr w:type="spellEnd"/>
+      <w:r>
+        <w:rPr>
+          <w:sz w:val="28"/>
+          <w:szCs w:val="28"/>
+        </w:rPr>
+        <w:t xml:space="preserve"> </w:t>
+      </w:r>
+      <w:proofErr w:type="spellStart"/>
+      <w:r>
+        <w:rPr>
+          <w:sz w:val="28"/>
+          <w:szCs w:val="28"/>
+        </w:rPr>
+        <w:t>not</w:t>
+      </w:r>
+      <w:proofErr w:type="spellEnd"/>
+      <w:r>
+        <w:rPr>
+          <w:sz w:val="28"/>
+          <w:szCs w:val="28"/>
+        </w:rPr>
+        <w:t xml:space="preserve"> </w:t>
+      </w:r>
+      <w:proofErr w:type="spellStart"/>
+      <w:r>
+        <w:rPr>
+          <w:sz w:val="28"/>
+          <w:szCs w:val="28"/>
+        </w:rPr>
+        <w:t>accidentally</w:t>
+      </w:r>
+      <w:proofErr w:type="spellEnd"/>
+      <w:r>
+        <w:rPr>
+          <w:sz w:val="28"/>
+          <w:szCs w:val="28"/>
+        </w:rPr>
+        <w:t xml:space="preserve"> </w:t>
+      </w:r>
+      <w:proofErr w:type="spellStart"/>
+      <w:r>
+        <w:rPr>
+          <w:sz w:val="28"/>
+          <w:szCs w:val="28"/>
+        </w:rPr>
+        <w:t>overbook</w:t>
+      </w:r>
+      <w:proofErr w:type="spellEnd"/>
+      <w:r>
+        <w:rPr>
+          <w:sz w:val="28"/>
+          <w:szCs w:val="28"/>
+        </w:rPr>
+        <w:t xml:space="preserve"> a table or </w:t>
+      </w:r>
+      <w:proofErr w:type="spellStart"/>
+      <w:r>
+        <w:rPr>
+          <w:sz w:val="28"/>
+          <w:szCs w:val="28"/>
+        </w:rPr>
+        <w:t>lose</w:t>
+      </w:r>
+      <w:proofErr w:type="spellEnd"/>
+      <w:r>
+        <w:rPr>
+          <w:sz w:val="28"/>
+          <w:szCs w:val="28"/>
+        </w:rPr>
+        <w:t xml:space="preserve"> </w:t>
+      </w:r>
+      <w:proofErr w:type="spellStart"/>
+      <w:r>
+        <w:rPr>
+          <w:sz w:val="28"/>
+          <w:szCs w:val="28"/>
+        </w:rPr>
+        <w:t>track</w:t>
+      </w:r>
+      <w:proofErr w:type="spellEnd"/>
+      <w:r>
+        <w:rPr>
+          <w:sz w:val="28"/>
+          <w:szCs w:val="28"/>
+        </w:rPr>
+        <w:t xml:space="preserve"> of </w:t>
+      </w:r>
+      <w:proofErr w:type="spellStart"/>
+      <w:r>
+        <w:rPr>
+          <w:sz w:val="28"/>
+          <w:szCs w:val="28"/>
+        </w:rPr>
+        <w:t>accurate</w:t>
+      </w:r>
+      <w:proofErr w:type="spellEnd"/>
+      <w:r>
+        <w:rPr>
+          <w:sz w:val="28"/>
+          <w:szCs w:val="28"/>
+        </w:rPr>
+        <w:t xml:space="preserve"> </w:t>
+      </w:r>
+      <w:proofErr w:type="spellStart"/>
+      <w:r>
+        <w:rPr>
+          <w:sz w:val="28"/>
+          <w:szCs w:val="28"/>
+        </w:rPr>
+        <w:t>expenses</w:t>
+      </w:r>
+      <w:proofErr w:type="spellEnd"/>
+      <w:r>
+        <w:rPr>
+          <w:sz w:val="28"/>
+          <w:szCs w:val="28"/>
+        </w:rPr>
+        <w:t>.</w:t>
+      </w:r>
+    </w:p>
     <w:p/>
     <w:sectPr>
       <w:pgSz w:w="11906" w:h="16838"/>
@@ -9136,6 +12507,155 @@
 <file path=word/numbering.xml><?xml version="1.0" encoding="utf-8"?>
 <w:numbering xmlns:wpc="http://schemas.microsoft.com/office/word/2010/wordprocessingCanvas" xmlns:cx="http://schemas.microsoft.com/office/drawing/2014/chartex" xmlns:cx1="http://schemas.microsoft.com/office/drawing/2015/9/8/chartex" xmlns:cx2="http://schemas.microsoft.com/office/drawing/2015/10/21/chartex" xmlns:cx3="http://schemas.microsoft.com/office/drawing/2016/5/9/chartex" xmlns:cx4="http://schemas.microsoft.com/office/drawing/2016/5/10/chartex" xmlns:cx5="http://schemas.microsoft.com/office/drawing/2016/5/11/chartex" xmlns:cx6="http://schemas.microsoft.com/office/drawing/2016/5/12/chartex" xmlns:cx7="http://schemas.microsoft.com/office/drawing/2016/5/13/chartex" xmlns:cx8="http://schemas.microsoft.com/office/drawing/2016/5/14/chartex" xmlns:mc="http://schemas.openxmlformats.org/markup-compatibility/2006" xmlns:aink="http://schemas.microsoft.com/office/drawing/2016/ink" xmlns:am3d="http://schemas.microsoft.com/office/drawing/2017/model3d" xmlns:o="urn:schemas-microsoft-com:office:office" xmlns:r="http://schemas.openxmlformats.org/officeDocument/2006/relationships" xmlns:m="http://schemas.openxmlformats.org/officeDocument/2006/math" xmlns:v="urn:schemas-microsoft-com:vml" xmlns:wp14="http://schemas.microsoft.com/office/word/2010/wordprocessingDrawing" xmlns:wp="http://schemas.openxmlformats.org/drawingml/2006/wordprocessingDrawing" xmlns:w10="urn:schemas-microsoft-com:office:word" xmlns:w="http://schemas.openxmlformats.org/wordprocessingml/2006/main" xmlns:w14="http://schemas.microsoft.com/office/word/2010/wordml" xmlns:w15="http://schemas.microsoft.com/office/word/2012/wordml" xmlns:w16cex="http://schemas.microsoft.com/office/word/2018/wordml/cex" xmlns:w16cid="http://schemas.microsoft.com/office/word/2016/wordml/cid" xmlns:w16="http://schemas.microsoft.com/office/word/2018/wordml" xmlns:w16sdtdh="http://schemas.microsoft.com/office/word/2020/wordml/sdtdatahash" xmlns:w16se="http://schemas.microsoft.com/office/word/2015/wordml/symex" xmlns:wpg="http://schemas.microsoft.com/office/word/2010/wordprocessingGroup" xmlns:wpi="http://schemas.microsoft.com/office/word/2010/wordprocessingInk" xmlns:wne="http://schemas.microsoft.com/office/word/2006/wordml" xmlns:wps="http://schemas.microsoft.com/office/word/2010/wordprocessingShape" mc:Ignorable="w14 w15 w16se w16cid w16 w16cex w16sdtdh wp14">
   <w:abstractNum w:abstractNumId="0" w15:restartNumberingAfterBreak="0">
+    <w:nsid w:val="13CF1E83"/>
+    <w:multiLevelType w:val="multilevel"/>
+    <w:tmpl w:val="63A65A52"/>
+    <w:lvl w:ilvl="0">
+      <w:start w:val="1"/>
+      <w:numFmt w:val="bullet"/>
+      <w:lvlText w:val=""/>
+      <w:lvlJc w:val="left"/>
+      <w:pPr>
+        <w:tabs>
+          <w:tab w:val="num" w:pos="720"/>
+        </w:tabs>
+        <w:ind w:left="720" w:hanging="360"/>
+      </w:pPr>
+      <w:rPr>
+        <w:rFonts w:ascii="Symbol" w:hAnsi="Symbol" w:hint="default"/>
+        <w:sz w:val="20"/>
+      </w:rPr>
+    </w:lvl>
+    <w:lvl w:ilvl="1" w:tentative="1">
+      <w:start w:val="1"/>
+      <w:numFmt w:val="bullet"/>
+      <w:lvlText w:val="o"/>
+      <w:lvlJc w:val="left"/>
+      <w:pPr>
+        <w:tabs>
+          <w:tab w:val="num" w:pos="1440"/>
+        </w:tabs>
+        <w:ind w:left="1440" w:hanging="360"/>
+      </w:pPr>
+      <w:rPr>
+        <w:rFonts w:ascii="Courier New" w:hAnsi="Courier New" w:hint="default"/>
+        <w:sz w:val="20"/>
+      </w:rPr>
+    </w:lvl>
+    <w:lvl w:ilvl="2" w:tentative="1">
+      <w:start w:val="1"/>
+      <w:numFmt w:val="bullet"/>
+      <w:lvlText w:val=""/>
+      <w:lvlJc w:val="left"/>
+      <w:pPr>
+        <w:tabs>
+          <w:tab w:val="num" w:pos="2160"/>
+        </w:tabs>
+        <w:ind w:left="2160" w:hanging="360"/>
+      </w:pPr>
+      <w:rPr>
+        <w:rFonts w:ascii="Wingdings" w:hAnsi="Wingdings" w:hint="default"/>
+        <w:sz w:val="20"/>
+      </w:rPr>
+    </w:lvl>
+    <w:lvl w:ilvl="3" w:tentative="1">
+      <w:start w:val="1"/>
+      <w:numFmt w:val="bullet"/>
+      <w:lvlText w:val=""/>
+      <w:lvlJc w:val="left"/>
+      <w:pPr>
+        <w:tabs>
+          <w:tab w:val="num" w:pos="2880"/>
+        </w:tabs>
+        <w:ind w:left="2880" w:hanging="360"/>
+      </w:pPr>
+      <w:rPr>
+        <w:rFonts w:ascii="Wingdings" w:hAnsi="Wingdings" w:hint="default"/>
+        <w:sz w:val="20"/>
+      </w:rPr>
+    </w:lvl>
+    <w:lvl w:ilvl="4" w:tentative="1">
+      <w:start w:val="1"/>
+      <w:numFmt w:val="bullet"/>
+      <w:lvlText w:val=""/>
+      <w:lvlJc w:val="left"/>
+      <w:pPr>
+        <w:tabs>
+          <w:tab w:val="num" w:pos="3600"/>
+        </w:tabs>
+        <w:ind w:left="3600" w:hanging="360"/>
+      </w:pPr>
+      <w:rPr>
+        <w:rFonts w:ascii="Wingdings" w:hAnsi="Wingdings" w:hint="default"/>
+        <w:sz w:val="20"/>
+      </w:rPr>
+    </w:lvl>
+    <w:lvl w:ilvl="5" w:tentative="1">
+      <w:start w:val="1"/>
+      <w:numFmt w:val="bullet"/>
+      <w:lvlText w:val=""/>
+      <w:lvlJc w:val="left"/>
+      <w:pPr>
+        <w:tabs>
+          <w:tab w:val="num" w:pos="4320"/>
+        </w:tabs>
+        <w:ind w:left="4320" w:hanging="360"/>
+      </w:pPr>
+      <w:rPr>
+        <w:rFonts w:ascii="Wingdings" w:hAnsi="Wingdings" w:hint="default"/>
+        <w:sz w:val="20"/>
+      </w:rPr>
+    </w:lvl>
+    <w:lvl w:ilvl="6" w:tentative="1">
+      <w:start w:val="1"/>
+      <w:numFmt w:val="bullet"/>
+      <w:lvlText w:val=""/>
+      <w:lvlJc w:val="left"/>
+      <w:pPr>
+        <w:tabs>
+          <w:tab w:val="num" w:pos="5040"/>
+        </w:tabs>
+        <w:ind w:left="5040" w:hanging="360"/>
+      </w:pPr>
+      <w:rPr>
+        <w:rFonts w:ascii="Wingdings" w:hAnsi="Wingdings" w:hint="default"/>
+        <w:sz w:val="20"/>
+      </w:rPr>
+    </w:lvl>
+    <w:lvl w:ilvl="7" w:tentative="1">
+      <w:start w:val="1"/>
+      <w:numFmt w:val="bullet"/>
+      <w:lvlText w:val=""/>
+      <w:lvlJc w:val="left"/>
+      <w:pPr>
+        <w:tabs>
+          <w:tab w:val="num" w:pos="5760"/>
+        </w:tabs>
+        <w:ind w:left="5760" w:hanging="360"/>
+      </w:pPr>
+      <w:rPr>
+        <w:rFonts w:ascii="Wingdings" w:hAnsi="Wingdings" w:hint="default"/>
+        <w:sz w:val="20"/>
+      </w:rPr>
+    </w:lvl>
+    <w:lvl w:ilvl="8" w:tentative="1">
+      <w:start w:val="1"/>
+      <w:numFmt w:val="bullet"/>
+      <w:lvlText w:val=""/>
+      <w:lvlJc w:val="left"/>
+      <w:pPr>
+        <w:tabs>
+          <w:tab w:val="num" w:pos="6480"/>
+        </w:tabs>
+        <w:ind w:left="6480" w:hanging="360"/>
+      </w:pPr>
+      <w:rPr>
+        <w:rFonts w:ascii="Wingdings" w:hAnsi="Wingdings" w:hint="default"/>
+        <w:sz w:val="20"/>
+      </w:rPr>
+    </w:lvl>
+  </w:abstractNum>
+  <w:abstractNum w:abstractNumId="1" w15:restartNumberingAfterBreak="0">
     <w:nsid w:val="15D71816"/>
     <w:multiLevelType w:val="multilevel"/>
     <w:tmpl w:val="4E547C2E"/>
@@ -9284,7 +12804,7 @@
       </w:rPr>
     </w:lvl>
   </w:abstractNum>
-  <w:abstractNum w:abstractNumId="1" w15:restartNumberingAfterBreak="0">
+  <w:abstractNum w:abstractNumId="2" w15:restartNumberingAfterBreak="0">
     <w:nsid w:val="21E7597A"/>
     <w:multiLevelType w:val="multilevel"/>
     <w:tmpl w:val="D7EE815C"/>
@@ -9433,7 +12953,156 @@
       </w:rPr>
     </w:lvl>
   </w:abstractNum>
-  <w:abstractNum w:abstractNumId="2" w15:restartNumberingAfterBreak="0">
+  <w:abstractNum w:abstractNumId="3" w15:restartNumberingAfterBreak="0">
+    <w:nsid w:val="29C767B1"/>
+    <w:multiLevelType w:val="multilevel"/>
+    <w:tmpl w:val="92902F1A"/>
+    <w:lvl w:ilvl="0">
+      <w:start w:val="1"/>
+      <w:numFmt w:val="bullet"/>
+      <w:lvlText w:val=""/>
+      <w:lvlJc w:val="left"/>
+      <w:pPr>
+        <w:tabs>
+          <w:tab w:val="num" w:pos="720"/>
+        </w:tabs>
+        <w:ind w:left="720" w:hanging="360"/>
+      </w:pPr>
+      <w:rPr>
+        <w:rFonts w:ascii="Symbol" w:hAnsi="Symbol" w:hint="default"/>
+        <w:sz w:val="20"/>
+      </w:rPr>
+    </w:lvl>
+    <w:lvl w:ilvl="1" w:tentative="1">
+      <w:start w:val="1"/>
+      <w:numFmt w:val="bullet"/>
+      <w:lvlText w:val="o"/>
+      <w:lvlJc w:val="left"/>
+      <w:pPr>
+        <w:tabs>
+          <w:tab w:val="num" w:pos="1440"/>
+        </w:tabs>
+        <w:ind w:left="1440" w:hanging="360"/>
+      </w:pPr>
+      <w:rPr>
+        <w:rFonts w:ascii="Courier New" w:hAnsi="Courier New" w:hint="default"/>
+        <w:sz w:val="20"/>
+      </w:rPr>
+    </w:lvl>
+    <w:lvl w:ilvl="2" w:tentative="1">
+      <w:start w:val="1"/>
+      <w:numFmt w:val="bullet"/>
+      <w:lvlText w:val=""/>
+      <w:lvlJc w:val="left"/>
+      <w:pPr>
+        <w:tabs>
+          <w:tab w:val="num" w:pos="2160"/>
+        </w:tabs>
+        <w:ind w:left="2160" w:hanging="360"/>
+      </w:pPr>
+      <w:rPr>
+        <w:rFonts w:ascii="Wingdings" w:hAnsi="Wingdings" w:hint="default"/>
+        <w:sz w:val="20"/>
+      </w:rPr>
+    </w:lvl>
+    <w:lvl w:ilvl="3" w:tentative="1">
+      <w:start w:val="1"/>
+      <w:numFmt w:val="bullet"/>
+      <w:lvlText w:val=""/>
+      <w:lvlJc w:val="left"/>
+      <w:pPr>
+        <w:tabs>
+          <w:tab w:val="num" w:pos="2880"/>
+        </w:tabs>
+        <w:ind w:left="2880" w:hanging="360"/>
+      </w:pPr>
+      <w:rPr>
+        <w:rFonts w:ascii="Wingdings" w:hAnsi="Wingdings" w:hint="default"/>
+        <w:sz w:val="20"/>
+      </w:rPr>
+    </w:lvl>
+    <w:lvl w:ilvl="4" w:tentative="1">
+      <w:start w:val="1"/>
+      <w:numFmt w:val="bullet"/>
+      <w:lvlText w:val=""/>
+      <w:lvlJc w:val="left"/>
+      <w:pPr>
+        <w:tabs>
+          <w:tab w:val="num" w:pos="3600"/>
+        </w:tabs>
+        <w:ind w:left="3600" w:hanging="360"/>
+      </w:pPr>
+      <w:rPr>
+        <w:rFonts w:ascii="Wingdings" w:hAnsi="Wingdings" w:hint="default"/>
+        <w:sz w:val="20"/>
+      </w:rPr>
+    </w:lvl>
+    <w:lvl w:ilvl="5" w:tentative="1">
+      <w:start w:val="1"/>
+      <w:numFmt w:val="bullet"/>
+      <w:lvlText w:val=""/>
+      <w:lvlJc w:val="left"/>
+      <w:pPr>
+        <w:tabs>
+          <w:tab w:val="num" w:pos="4320"/>
+        </w:tabs>
+        <w:ind w:left="4320" w:hanging="360"/>
+      </w:pPr>
+      <w:rPr>
+        <w:rFonts w:ascii="Wingdings" w:hAnsi="Wingdings" w:hint="default"/>
+        <w:sz w:val="20"/>
+      </w:rPr>
+    </w:lvl>
+    <w:lvl w:ilvl="6" w:tentative="1">
+      <w:start w:val="1"/>
+      <w:numFmt w:val="bullet"/>
+      <w:lvlText w:val=""/>
+      <w:lvlJc w:val="left"/>
+      <w:pPr>
+        <w:tabs>
+          <w:tab w:val="num" w:pos="5040"/>
+        </w:tabs>
+        <w:ind w:left="5040" w:hanging="360"/>
+      </w:pPr>
+      <w:rPr>
+        <w:rFonts w:ascii="Wingdings" w:hAnsi="Wingdings" w:hint="default"/>
+        <w:sz w:val="20"/>
+      </w:rPr>
+    </w:lvl>
+    <w:lvl w:ilvl="7" w:tentative="1">
+      <w:start w:val="1"/>
+      <w:numFmt w:val="bullet"/>
+      <w:lvlText w:val=""/>
+      <w:lvlJc w:val="left"/>
+      <w:pPr>
+        <w:tabs>
+          <w:tab w:val="num" w:pos="5760"/>
+        </w:tabs>
+        <w:ind w:left="5760" w:hanging="360"/>
+      </w:pPr>
+      <w:rPr>
+        <w:rFonts w:ascii="Wingdings" w:hAnsi="Wingdings" w:hint="default"/>
+        <w:sz w:val="20"/>
+      </w:rPr>
+    </w:lvl>
+    <w:lvl w:ilvl="8" w:tentative="1">
+      <w:start w:val="1"/>
+      <w:numFmt w:val="bullet"/>
+      <w:lvlText w:val=""/>
+      <w:lvlJc w:val="left"/>
+      <w:pPr>
+        <w:tabs>
+          <w:tab w:val="num" w:pos="6480"/>
+        </w:tabs>
+        <w:ind w:left="6480" w:hanging="360"/>
+      </w:pPr>
+      <w:rPr>
+        <w:rFonts w:ascii="Wingdings" w:hAnsi="Wingdings" w:hint="default"/>
+        <w:sz w:val="20"/>
+      </w:rPr>
+    </w:lvl>
+  </w:abstractNum>
+  <w:abstractNum w:abstractNumId="4" w15:restartNumberingAfterBreak="0">
     <w:nsid w:val="39E84BC5"/>
     <w:multiLevelType w:val="multilevel"/>
     <w:tmpl w:val="1BF84838"/>
@@ -9582,14 +13251,324 @@
       </w:rPr>
     </w:lvl>
   </w:abstractNum>
+  <w:abstractNum w:abstractNumId="5" w15:restartNumberingAfterBreak="0">
+    <w:nsid w:val="526F4253"/>
+    <w:multiLevelType w:val="multilevel"/>
+    <w:tmpl w:val="6FF21688"/>
+    <w:lvl w:ilvl="0">
+      <w:start w:val="1"/>
+      <w:numFmt w:val="bullet"/>
+      <w:lvlText w:val=""/>
+      <w:lvlJc w:val="left"/>
+      <w:pPr>
+        <w:tabs>
+          <w:tab w:val="num" w:pos="720"/>
+        </w:tabs>
+        <w:ind w:left="720" w:hanging="360"/>
+      </w:pPr>
+      <w:rPr>
+        <w:rFonts w:ascii="Symbol" w:hAnsi="Symbol" w:hint="default"/>
+        <w:sz w:val="20"/>
+      </w:rPr>
+    </w:lvl>
+    <w:lvl w:ilvl="1" w:tentative="1">
+      <w:start w:val="1"/>
+      <w:numFmt w:val="bullet"/>
+      <w:lvlText w:val="o"/>
+      <w:lvlJc w:val="left"/>
+      <w:pPr>
+        <w:tabs>
+          <w:tab w:val="num" w:pos="1440"/>
+        </w:tabs>
+        <w:ind w:left="1440" w:hanging="360"/>
+      </w:pPr>
+      <w:rPr>
+        <w:rFonts w:ascii="Courier New" w:hAnsi="Courier New" w:hint="default"/>
+        <w:sz w:val="20"/>
+      </w:rPr>
+    </w:lvl>
+    <w:lvl w:ilvl="2" w:tentative="1">
+      <w:start w:val="1"/>
+      <w:numFmt w:val="bullet"/>
+      <w:lvlText w:val=""/>
+      <w:lvlJc w:val="left"/>
+      <w:pPr>
+        <w:tabs>
+          <w:tab w:val="num" w:pos="2160"/>
+        </w:tabs>
+        <w:ind w:left="2160" w:hanging="360"/>
+      </w:pPr>
+      <w:rPr>
+        <w:rFonts w:ascii="Wingdings" w:hAnsi="Wingdings" w:hint="default"/>
+        <w:sz w:val="20"/>
+      </w:rPr>
+    </w:lvl>
+    <w:lvl w:ilvl="3" w:tentative="1">
+      <w:start w:val="1"/>
+      <w:numFmt w:val="bullet"/>
+      <w:lvlText w:val=""/>
+      <w:lvlJc w:val="left"/>
+      <w:pPr>
+        <w:tabs>
+          <w:tab w:val="num" w:pos="2880"/>
+        </w:tabs>
+        <w:ind w:left="2880" w:hanging="360"/>
+      </w:pPr>
+      <w:rPr>
+        <w:rFonts w:ascii="Wingdings" w:hAnsi="Wingdings" w:hint="default"/>
+        <w:sz w:val="20"/>
+      </w:rPr>
+    </w:lvl>
+    <w:lvl w:ilvl="4" w:tentative="1">
+      <w:start w:val="1"/>
+      <w:numFmt w:val="bullet"/>
+      <w:lvlText w:val=""/>
+      <w:lvlJc w:val="left"/>
+      <w:pPr>
+        <w:tabs>
+          <w:tab w:val="num" w:pos="3600"/>
+        </w:tabs>
+        <w:ind w:left="3600" w:hanging="360"/>
+      </w:pPr>
+      <w:rPr>
+        <w:rFonts w:ascii="Wingdings" w:hAnsi="Wingdings" w:hint="default"/>
+        <w:sz w:val="20"/>
+      </w:rPr>
+    </w:lvl>
+    <w:lvl w:ilvl="5" w:tentative="1">
+      <w:start w:val="1"/>
+      <w:numFmt w:val="bullet"/>
+      <w:lvlText w:val=""/>
+      <w:lvlJc w:val="left"/>
+      <w:pPr>
+        <w:tabs>
+          <w:tab w:val="num" w:pos="4320"/>
+        </w:tabs>
+        <w:ind w:left="4320" w:hanging="360"/>
+      </w:pPr>
+      <w:rPr>
+        <w:rFonts w:ascii="Wingdings" w:hAnsi="Wingdings" w:hint="default"/>
+        <w:sz w:val="20"/>
+      </w:rPr>
+    </w:lvl>
+    <w:lvl w:ilvl="6" w:tentative="1">
+      <w:start w:val="1"/>
+      <w:numFmt w:val="bullet"/>
+      <w:lvlText w:val=""/>
+      <w:lvlJc w:val="left"/>
+      <w:pPr>
+        <w:tabs>
+          <w:tab w:val="num" w:pos="5040"/>
+        </w:tabs>
+        <w:ind w:left="5040" w:hanging="360"/>
+      </w:pPr>
+      <w:rPr>
+        <w:rFonts w:ascii="Wingdings" w:hAnsi="Wingdings" w:hint="default"/>
+        <w:sz w:val="20"/>
+      </w:rPr>
+    </w:lvl>
+    <w:lvl w:ilvl="7" w:tentative="1">
+      <w:start w:val="1"/>
+      <w:numFmt w:val="bullet"/>
+      <w:lvlText w:val=""/>
+      <w:lvlJc w:val="left"/>
+      <w:pPr>
+        <w:tabs>
+          <w:tab w:val="num" w:pos="5760"/>
+        </w:tabs>
+        <w:ind w:left="5760" w:hanging="360"/>
+      </w:pPr>
+      <w:rPr>
+        <w:rFonts w:ascii="Wingdings" w:hAnsi="Wingdings" w:hint="default"/>
+        <w:sz w:val="20"/>
+      </w:rPr>
+    </w:lvl>
+    <w:lvl w:ilvl="8" w:tentative="1">
+      <w:start w:val="1"/>
+      <w:numFmt w:val="bullet"/>
+      <w:lvlText w:val=""/>
+      <w:lvlJc w:val="left"/>
+      <w:pPr>
+        <w:tabs>
+          <w:tab w:val="num" w:pos="6480"/>
+        </w:tabs>
+        <w:ind w:left="6480" w:hanging="360"/>
+      </w:pPr>
+      <w:rPr>
+        <w:rFonts w:ascii="Wingdings" w:hAnsi="Wingdings" w:hint="default"/>
+        <w:sz w:val="20"/>
+      </w:rPr>
+    </w:lvl>
+  </w:abstractNum>
+  <w:abstractNum w:abstractNumId="6" w15:restartNumberingAfterBreak="0">
+    <w:nsid w:val="6F1C62D1"/>
+    <w:multiLevelType w:val="multilevel"/>
+    <w:tmpl w:val="7004BA2E"/>
+    <w:lvl w:ilvl="0">
+      <w:start w:val="1"/>
+      <w:numFmt w:val="bullet"/>
+      <w:lvlText w:val=""/>
+      <w:lvlJc w:val="left"/>
+      <w:pPr>
+        <w:tabs>
+          <w:tab w:val="num" w:pos="720"/>
+        </w:tabs>
+        <w:ind w:left="720" w:hanging="360"/>
+      </w:pPr>
+      <w:rPr>
+        <w:rFonts w:ascii="Symbol" w:hAnsi="Symbol" w:hint="default"/>
+        <w:sz w:val="20"/>
+      </w:rPr>
+    </w:lvl>
+    <w:lvl w:ilvl="1" w:tentative="1">
+      <w:start w:val="1"/>
+      <w:numFmt w:val="bullet"/>
+      <w:lvlText w:val="o"/>
+      <w:lvlJc w:val="left"/>
+      <w:pPr>
+        <w:tabs>
+          <w:tab w:val="num" w:pos="1440"/>
+        </w:tabs>
+        <w:ind w:left="1440" w:hanging="360"/>
+      </w:pPr>
+      <w:rPr>
+        <w:rFonts w:ascii="Courier New" w:hAnsi="Courier New" w:hint="default"/>
+        <w:sz w:val="20"/>
+      </w:rPr>
+    </w:lvl>
+    <w:lvl w:ilvl="2" w:tentative="1">
+      <w:start w:val="1"/>
+      <w:numFmt w:val="bullet"/>
+      <w:lvlText w:val=""/>
+      <w:lvlJc w:val="left"/>
+      <w:pPr>
+        <w:tabs>
+          <w:tab w:val="num" w:pos="2160"/>
+        </w:tabs>
+        <w:ind w:left="2160" w:hanging="360"/>
+      </w:pPr>
+      <w:rPr>
+        <w:rFonts w:ascii="Wingdings" w:hAnsi="Wingdings" w:hint="default"/>
+        <w:sz w:val="20"/>
+      </w:rPr>
+    </w:lvl>
+    <w:lvl w:ilvl="3" w:tentative="1">
+      <w:start w:val="1"/>
+      <w:numFmt w:val="bullet"/>
+      <w:lvlText w:val=""/>
+      <w:lvlJc w:val="left"/>
+      <w:pPr>
+        <w:tabs>
+          <w:tab w:val="num" w:pos="2880"/>
+        </w:tabs>
+        <w:ind w:left="2880" w:hanging="360"/>
+      </w:pPr>
+      <w:rPr>
+        <w:rFonts w:ascii="Wingdings" w:hAnsi="Wingdings" w:hint="default"/>
+        <w:sz w:val="20"/>
+      </w:rPr>
+    </w:lvl>
+    <w:lvl w:ilvl="4" w:tentative="1">
+      <w:start w:val="1"/>
+      <w:numFmt w:val="bullet"/>
+      <w:lvlText w:val=""/>
+      <w:lvlJc w:val="left"/>
+      <w:pPr>
+        <w:tabs>
+          <w:tab w:val="num" w:pos="3600"/>
+        </w:tabs>
+        <w:ind w:left="3600" w:hanging="360"/>
+      </w:pPr>
+      <w:rPr>
+        <w:rFonts w:ascii="Wingdings" w:hAnsi="Wingdings" w:hint="default"/>
+        <w:sz w:val="20"/>
+      </w:rPr>
+    </w:lvl>
+    <w:lvl w:ilvl="5" w:tentative="1">
+      <w:start w:val="1"/>
+      <w:numFmt w:val="bullet"/>
+      <w:lvlText w:val=""/>
+      <w:lvlJc w:val="left"/>
+      <w:pPr>
+        <w:tabs>
+          <w:tab w:val="num" w:pos="4320"/>
+        </w:tabs>
+        <w:ind w:left="4320" w:hanging="360"/>
+      </w:pPr>
+      <w:rPr>
+        <w:rFonts w:ascii="Wingdings" w:hAnsi="Wingdings" w:hint="default"/>
+        <w:sz w:val="20"/>
+      </w:rPr>
+    </w:lvl>
+    <w:lvl w:ilvl="6" w:tentative="1">
+      <w:start w:val="1"/>
+      <w:numFmt w:val="bullet"/>
+      <w:lvlText w:val=""/>
+      <w:lvlJc w:val="left"/>
+      <w:pPr>
+        <w:tabs>
+          <w:tab w:val="num" w:pos="5040"/>
+        </w:tabs>
+        <w:ind w:left="5040" w:hanging="360"/>
+      </w:pPr>
+      <w:rPr>
+        <w:rFonts w:ascii="Wingdings" w:hAnsi="Wingdings" w:hint="default"/>
+        <w:sz w:val="20"/>
+      </w:rPr>
+    </w:lvl>
+    <w:lvl w:ilvl="7" w:tentative="1">
+      <w:start w:val="1"/>
+      <w:numFmt w:val="bullet"/>
+      <w:lvlText w:val=""/>
+      <w:lvlJc w:val="left"/>
+      <w:pPr>
+        <w:tabs>
+          <w:tab w:val="num" w:pos="5760"/>
+        </w:tabs>
+        <w:ind w:left="5760" w:hanging="360"/>
+      </w:pPr>
+      <w:rPr>
+        <w:rFonts w:ascii="Wingdings" w:hAnsi="Wingdings" w:hint="default"/>
+        <w:sz w:val="20"/>
+      </w:rPr>
+    </w:lvl>
+    <w:lvl w:ilvl="8" w:tentative="1">
+      <w:start w:val="1"/>
+      <w:numFmt w:val="bullet"/>
+      <w:lvlText w:val=""/>
+      <w:lvlJc w:val="left"/>
+      <w:pPr>
+        <w:tabs>
+          <w:tab w:val="num" w:pos="6480"/>
+        </w:tabs>
+        <w:ind w:left="6480" w:hanging="360"/>
+      </w:pPr>
+      <w:rPr>
+        <w:rFonts w:ascii="Wingdings" w:hAnsi="Wingdings" w:hint="default"/>
+        <w:sz w:val="20"/>
+      </w:rPr>
+    </w:lvl>
+  </w:abstractNum>
   <w:num w:numId="1">
+    <w:abstractNumId w:val="2"/>
+  </w:num>
+  <w:num w:numId="2">
     <w:abstractNumId w:val="1"/>
   </w:num>
-  <w:num w:numId="2">
+  <w:num w:numId="3">
+    <w:abstractNumId w:val="4"/>
+  </w:num>
+  <w:num w:numId="4">
+    <w:abstractNumId w:val="5"/>
+  </w:num>
+  <w:num w:numId="5">
+    <w:abstractNumId w:val="6"/>
+  </w:num>
+  <w:num w:numId="6">
     <w:abstractNumId w:val="0"/>
   </w:num>
-  <w:num w:numId="3">
-    <w:abstractNumId w:val="2"/>
+  <w:num w:numId="7">
+    <w:abstractNumId w:val="3"/>
   </w:num>
 </w:numbering>
 </file>

</xml_diff>

<commit_message>
Removed temporary Word files
</commit_message>
<xml_diff>
--- a/labs/LAB2_ISS.docx
+++ b/labs/LAB2_ISS.docx
@@ -9518,23 +9518,7 @@
           <w:sz w:val="28"/>
           <w:szCs w:val="28"/>
         </w:rPr>
-        <w:t xml:space="preserve"> (e.g., </w:t>
-      </w:r>
-      <w:proofErr w:type="spellStart"/>
-      <w:r>
-        <w:rPr>
-          <w:sz w:val="28"/>
-          <w:szCs w:val="28"/>
-        </w:rPr>
-        <w:t>bcrypt</w:t>
-      </w:r>
-      <w:proofErr w:type="spellEnd"/>
-      <w:r>
-        <w:rPr>
-          <w:sz w:val="28"/>
-          <w:szCs w:val="28"/>
-        </w:rPr>
-        <w:t xml:space="preserve">) </w:t>
+        <w:t xml:space="preserve"> </w:t>
       </w:r>
       <w:proofErr w:type="spellStart"/>
       <w:r>

</xml_diff>